<commit_message>
Add Table S3 (parameter breakdown) and Figure S2 (random effects)
- Add 17_table_s3_parameters.R: alarm parameter breakdown by priority level
  CRISIS exclusively comprises life-threatening arrhythmias (V.Fib/V.Tachy/Asystole)
- Add 18_figure_s2_random_effects.R: caterpillar plot of bed-level random intercepts
  Shows no single bed location disproportionately drives findings
- Note: bed-level random intercepts reflect location characteristics (not individual
  patients) as bed occupancy changes throughout the observation period
- Update FiguresandTables_ver2.1.docx

Co-Authored-By: Claude Sonnet 4.6 <noreply@anthropic.com>
</commit_message>
<xml_diff>
--- a/outputs/FiguresandTables_ver2.1.docx
+++ b/outputs/FiguresandTables_ver2.1.docx
@@ -3408,7 +3408,23 @@
           <w:szCs w:val="22"/>
         </w:rPr>
         <w:lastRenderedPageBreak/>
-        <w:t xml:space="preserve">Figure2. </w:t>
+        <w:t>Figure</w:t>
+      </w:r>
+      <w:r>
+        <w:rPr>
+          <w:rFonts w:ascii="Times New Roman" w:hAnsi="Times New Roman" w:cs="Times New Roman"/>
+          <w:sz w:val="22"/>
+          <w:szCs w:val="22"/>
+        </w:rPr>
+        <w:t xml:space="preserve"> </w:t>
+      </w:r>
+      <w:r>
+        <w:rPr>
+          <w:rFonts w:ascii="Times New Roman" w:hAnsi="Times New Roman" w:cs="Times New Roman"/>
+          <w:sz w:val="22"/>
+          <w:szCs w:val="22"/>
+        </w:rPr>
+        <w:t xml:space="preserve">2. </w:t>
       </w:r>
       <w:r>
         <w:rPr>
@@ -8512,26 +8528,6 @@
     </w:p>
     <w:p>
       <w:pPr>
-        <w:widowControl/>
-        <w:jc w:val="left"/>
-        <w:rPr>
-          <w:rFonts w:ascii="Times New Roman" w:hAnsi="Times New Roman" w:cs="Times New Roman"/>
-          <w:sz w:val="22"/>
-          <w:szCs w:val="22"/>
-        </w:rPr>
-      </w:pPr>
-      <w:r>
-        <w:rPr>
-          <w:rFonts w:ascii="Times New Roman" w:hAnsi="Times New Roman" w:cs="Times New Roman"/>
-          <w:sz w:val="22"/>
-          <w:szCs w:val="22"/>
-        </w:rPr>
-        <w:lastRenderedPageBreak/>
-        <w:br w:type="page"/>
-      </w:r>
-    </w:p>
-    <w:p>
-      <w:pPr>
         <w:tabs>
           <w:tab w:val="left" w:pos="1196"/>
         </w:tabs>
@@ -8764,12 +8760,3002 @@
         </w:rPr>
         <w:br w:type="page"/>
       </w:r>
+      <w:r>
+        <w:rPr>
+          <w:rFonts w:ascii="Times New Roman" w:hAnsi="Times New Roman" w:cs="Times New Roman"/>
+          <w:sz w:val="22"/>
+          <w:szCs w:val="22"/>
+        </w:rPr>
+        <w:lastRenderedPageBreak/>
+        <w:t>Table S3.</w:t>
+      </w:r>
+      <w:r>
+        <w:rPr>
+          <w:rFonts w:ascii="Times New Roman" w:hAnsi="Times New Roman" w:cs="Times New Roman"/>
+          <w:sz w:val="22"/>
+          <w:szCs w:val="22"/>
+        </w:rPr>
+        <w:t xml:space="preserve"> </w:t>
+      </w:r>
+      <w:r>
+        <w:rPr>
+          <w:rFonts w:ascii="Times New Roman" w:hAnsi="Times New Roman" w:cs="Times New Roman"/>
+          <w:sz w:val="22"/>
+          <w:szCs w:val="22"/>
+        </w:rPr>
+        <w:t>Distribution of clinical alarm events by parameter and priority level</w:t>
+      </w:r>
+    </w:p>
+    <w:tbl>
+      <w:tblPr>
+        <w:tblStyle w:val="aa"/>
+        <w:tblW w:w="11341" w:type="dxa"/>
+        <w:tblInd w:w="-856" w:type="dxa"/>
+        <w:tblBorders>
+          <w:left w:val="none" w:sz="0" w:space="0" w:color="auto"/>
+          <w:right w:val="none" w:sz="0" w:space="0" w:color="auto"/>
+          <w:insideH w:val="none" w:sz="0" w:space="0" w:color="auto"/>
+          <w:insideV w:val="none" w:sz="0" w:space="0" w:color="auto"/>
+        </w:tblBorders>
+        <w:tblLook w:val="04A0" w:firstRow="1" w:lastRow="0" w:firstColumn="1" w:lastColumn="0" w:noHBand="0" w:noVBand="1"/>
+      </w:tblPr>
+      <w:tblGrid>
+        <w:gridCol w:w="1844"/>
+        <w:gridCol w:w="2546"/>
+        <w:gridCol w:w="1737"/>
+        <w:gridCol w:w="1738"/>
+        <w:gridCol w:w="1738"/>
+        <w:gridCol w:w="1738"/>
+      </w:tblGrid>
+      <w:tr>
+        <w:tc>
+          <w:tcPr>
+            <w:tcW w:w="1844" w:type="dxa"/>
+            <w:tcBorders>
+              <w:top w:val="single" w:sz="4" w:space="0" w:color="auto"/>
+              <w:bottom w:val="single" w:sz="4" w:space="0" w:color="auto"/>
+            </w:tcBorders>
+            <w:vAlign w:val="center"/>
+          </w:tcPr>
+          <w:p>
+            <w:pPr>
+              <w:widowControl/>
+              <w:jc w:val="left"/>
+              <w:rPr>
+                <w:rFonts w:ascii="Times New Roman" w:hAnsi="Times New Roman" w:cs="Times New Roman"/>
+                <w:sz w:val="22"/>
+                <w:szCs w:val="22"/>
+              </w:rPr>
+            </w:pPr>
+            <w:r>
+              <w:rPr>
+                <w:rFonts w:ascii="Times New Roman" w:eastAsia="Yu Gothic" w:hAnsi="Times New Roman" w:cs="Times New Roman"/>
+                <w:color w:val="000000"/>
+                <w:sz w:val="22"/>
+                <w:szCs w:val="22"/>
+              </w:rPr>
+              <w:t>Category</w:t>
+            </w:r>
+          </w:p>
+        </w:tc>
+        <w:tc>
+          <w:tcPr>
+            <w:tcW w:w="2546" w:type="dxa"/>
+            <w:tcBorders>
+              <w:top w:val="single" w:sz="4" w:space="0" w:color="auto"/>
+              <w:bottom w:val="single" w:sz="4" w:space="0" w:color="auto"/>
+            </w:tcBorders>
+            <w:vAlign w:val="center"/>
+          </w:tcPr>
+          <w:p>
+            <w:pPr>
+              <w:widowControl/>
+              <w:jc w:val="left"/>
+              <w:rPr>
+                <w:rFonts w:ascii="Times New Roman" w:hAnsi="Times New Roman" w:cs="Times New Roman"/>
+                <w:sz w:val="22"/>
+                <w:szCs w:val="22"/>
+              </w:rPr>
+            </w:pPr>
+            <w:r>
+              <w:rPr>
+                <w:rFonts w:ascii="Times New Roman" w:eastAsia="Yu Gothic" w:hAnsi="Times New Roman" w:cs="Times New Roman"/>
+                <w:color w:val="000000"/>
+                <w:sz w:val="22"/>
+                <w:szCs w:val="22"/>
+              </w:rPr>
+              <w:t>Parameter</w:t>
+            </w:r>
+          </w:p>
+        </w:tc>
+        <w:tc>
+          <w:tcPr>
+            <w:tcW w:w="1737" w:type="dxa"/>
+            <w:tcBorders>
+              <w:top w:val="single" w:sz="4" w:space="0" w:color="auto"/>
+              <w:bottom w:val="single" w:sz="4" w:space="0" w:color="auto"/>
+            </w:tcBorders>
+            <w:vAlign w:val="center"/>
+          </w:tcPr>
+          <w:p>
+            <w:pPr>
+              <w:widowControl/>
+              <w:jc w:val="center"/>
+              <w:rPr>
+                <w:rFonts w:ascii="Times New Roman" w:hAnsi="Times New Roman" w:cs="Times New Roman"/>
+                <w:sz w:val="22"/>
+                <w:szCs w:val="22"/>
+              </w:rPr>
+            </w:pPr>
+            <w:r>
+              <w:rPr>
+                <w:rFonts w:ascii="Times New Roman" w:eastAsia="Yu Gothic" w:hAnsi="Times New Roman" w:cs="Times New Roman"/>
+                <w:color w:val="000000"/>
+                <w:sz w:val="22"/>
+                <w:szCs w:val="22"/>
+              </w:rPr>
+              <w:t>ADVISORY</w:t>
+            </w:r>
+          </w:p>
+        </w:tc>
+        <w:tc>
+          <w:tcPr>
+            <w:tcW w:w="1738" w:type="dxa"/>
+            <w:tcBorders>
+              <w:top w:val="single" w:sz="4" w:space="0" w:color="auto"/>
+              <w:bottom w:val="single" w:sz="4" w:space="0" w:color="auto"/>
+            </w:tcBorders>
+            <w:vAlign w:val="center"/>
+          </w:tcPr>
+          <w:p>
+            <w:pPr>
+              <w:widowControl/>
+              <w:jc w:val="center"/>
+              <w:rPr>
+                <w:rFonts w:ascii="Times New Roman" w:hAnsi="Times New Roman" w:cs="Times New Roman"/>
+                <w:sz w:val="22"/>
+                <w:szCs w:val="22"/>
+              </w:rPr>
+            </w:pPr>
+            <w:r>
+              <w:rPr>
+                <w:rFonts w:ascii="Times New Roman" w:eastAsia="Yu Gothic" w:hAnsi="Times New Roman" w:cs="Times New Roman"/>
+                <w:color w:val="000000"/>
+                <w:sz w:val="22"/>
+                <w:szCs w:val="22"/>
+              </w:rPr>
+              <w:t>WARNING</w:t>
+            </w:r>
+          </w:p>
+        </w:tc>
+        <w:tc>
+          <w:tcPr>
+            <w:tcW w:w="1738" w:type="dxa"/>
+            <w:tcBorders>
+              <w:top w:val="single" w:sz="4" w:space="0" w:color="auto"/>
+              <w:bottom w:val="single" w:sz="4" w:space="0" w:color="auto"/>
+            </w:tcBorders>
+            <w:vAlign w:val="center"/>
+          </w:tcPr>
+          <w:p>
+            <w:pPr>
+              <w:widowControl/>
+              <w:jc w:val="center"/>
+              <w:rPr>
+                <w:rFonts w:ascii="Times New Roman" w:hAnsi="Times New Roman" w:cs="Times New Roman"/>
+                <w:sz w:val="22"/>
+                <w:szCs w:val="22"/>
+              </w:rPr>
+            </w:pPr>
+            <w:r>
+              <w:rPr>
+                <w:rFonts w:ascii="Times New Roman" w:eastAsia="Yu Gothic" w:hAnsi="Times New Roman" w:cs="Times New Roman"/>
+                <w:color w:val="000000"/>
+                <w:sz w:val="22"/>
+                <w:szCs w:val="22"/>
+              </w:rPr>
+              <w:t>CRISIS</w:t>
+            </w:r>
+          </w:p>
+        </w:tc>
+        <w:tc>
+          <w:tcPr>
+            <w:tcW w:w="1738" w:type="dxa"/>
+            <w:tcBorders>
+              <w:top w:val="single" w:sz="4" w:space="0" w:color="auto"/>
+              <w:bottom w:val="single" w:sz="4" w:space="0" w:color="auto"/>
+            </w:tcBorders>
+            <w:vAlign w:val="center"/>
+          </w:tcPr>
+          <w:p>
+            <w:pPr>
+              <w:widowControl/>
+              <w:jc w:val="center"/>
+              <w:rPr>
+                <w:rFonts w:ascii="Times New Roman" w:hAnsi="Times New Roman" w:cs="Times New Roman"/>
+                <w:sz w:val="22"/>
+                <w:szCs w:val="22"/>
+              </w:rPr>
+            </w:pPr>
+            <w:r>
+              <w:rPr>
+                <w:rFonts w:ascii="Times New Roman" w:eastAsia="Yu Gothic" w:hAnsi="Times New Roman" w:cs="Times New Roman"/>
+                <w:color w:val="000000"/>
+                <w:sz w:val="22"/>
+                <w:szCs w:val="22"/>
+              </w:rPr>
+              <w:t>Total</w:t>
+            </w:r>
+          </w:p>
+        </w:tc>
+      </w:tr>
+      <w:tr>
+        <w:tc>
+          <w:tcPr>
+            <w:tcW w:w="1844" w:type="dxa"/>
+            <w:tcBorders>
+              <w:top w:val="single" w:sz="4" w:space="0" w:color="auto"/>
+            </w:tcBorders>
+            <w:vAlign w:val="center"/>
+          </w:tcPr>
+          <w:p>
+            <w:pPr>
+              <w:widowControl/>
+              <w:jc w:val="left"/>
+              <w:rPr>
+                <w:rFonts w:ascii="Times New Roman" w:hAnsi="Times New Roman" w:cs="Times New Roman"/>
+                <w:sz w:val="22"/>
+                <w:szCs w:val="22"/>
+              </w:rPr>
+            </w:pPr>
+            <w:r>
+              <w:rPr>
+                <w:rFonts w:ascii="Times New Roman" w:eastAsia="Yu Gothic" w:hAnsi="Times New Roman" w:cs="Times New Roman"/>
+                <w:color w:val="000000"/>
+                <w:sz w:val="22"/>
+                <w:szCs w:val="22"/>
+              </w:rPr>
+              <w:t>Cardiac rhythm</w:t>
+            </w:r>
+          </w:p>
+        </w:tc>
+        <w:tc>
+          <w:tcPr>
+            <w:tcW w:w="2546" w:type="dxa"/>
+            <w:tcBorders>
+              <w:top w:val="single" w:sz="4" w:space="0" w:color="auto"/>
+            </w:tcBorders>
+            <w:vAlign w:val="center"/>
+          </w:tcPr>
+          <w:p>
+            <w:pPr>
+              <w:widowControl/>
+              <w:jc w:val="left"/>
+              <w:rPr>
+                <w:rFonts w:ascii="Times New Roman" w:hAnsi="Times New Roman" w:cs="Times New Roman"/>
+                <w:sz w:val="22"/>
+                <w:szCs w:val="22"/>
+              </w:rPr>
+            </w:pPr>
+            <w:r>
+              <w:rPr>
+                <w:rFonts w:ascii="Times New Roman" w:eastAsia="Yu Gothic" w:hAnsi="Times New Roman" w:cs="Times New Roman"/>
+                <w:color w:val="000000"/>
+                <w:sz w:val="22"/>
+                <w:szCs w:val="22"/>
+              </w:rPr>
+              <w:t>Ventricular fibrillation</w:t>
+            </w:r>
+          </w:p>
+        </w:tc>
+        <w:tc>
+          <w:tcPr>
+            <w:tcW w:w="1737" w:type="dxa"/>
+            <w:tcBorders>
+              <w:top w:val="single" w:sz="4" w:space="0" w:color="auto"/>
+            </w:tcBorders>
+            <w:vAlign w:val="center"/>
+          </w:tcPr>
+          <w:p>
+            <w:pPr>
+              <w:widowControl/>
+              <w:jc w:val="center"/>
+              <w:rPr>
+                <w:rFonts w:ascii="Times New Roman" w:hAnsi="Times New Roman" w:cs="Times New Roman"/>
+                <w:sz w:val="22"/>
+                <w:szCs w:val="22"/>
+              </w:rPr>
+            </w:pPr>
+            <w:r>
+              <w:rPr>
+                <w:rFonts w:ascii="Times New Roman" w:eastAsia="Yu Gothic" w:hAnsi="Times New Roman" w:cs="Times New Roman"/>
+                <w:color w:val="000000"/>
+                <w:sz w:val="22"/>
+                <w:szCs w:val="22"/>
+              </w:rPr>
+              <w:t>—</w:t>
+            </w:r>
+          </w:p>
+        </w:tc>
+        <w:tc>
+          <w:tcPr>
+            <w:tcW w:w="1738" w:type="dxa"/>
+            <w:tcBorders>
+              <w:top w:val="single" w:sz="4" w:space="0" w:color="auto"/>
+            </w:tcBorders>
+            <w:vAlign w:val="center"/>
+          </w:tcPr>
+          <w:p>
+            <w:pPr>
+              <w:widowControl/>
+              <w:jc w:val="center"/>
+              <w:rPr>
+                <w:rFonts w:ascii="Times New Roman" w:hAnsi="Times New Roman" w:cs="Times New Roman"/>
+                <w:sz w:val="22"/>
+                <w:szCs w:val="22"/>
+              </w:rPr>
+            </w:pPr>
+            <w:r>
+              <w:rPr>
+                <w:rFonts w:ascii="Times New Roman" w:eastAsia="Yu Gothic" w:hAnsi="Times New Roman" w:cs="Times New Roman"/>
+                <w:color w:val="000000"/>
+                <w:sz w:val="22"/>
+                <w:szCs w:val="22"/>
+              </w:rPr>
+              <w:t>—</w:t>
+            </w:r>
+          </w:p>
+        </w:tc>
+        <w:tc>
+          <w:tcPr>
+            <w:tcW w:w="1738" w:type="dxa"/>
+            <w:tcBorders>
+              <w:top w:val="single" w:sz="4" w:space="0" w:color="auto"/>
+            </w:tcBorders>
+            <w:vAlign w:val="center"/>
+          </w:tcPr>
+          <w:p>
+            <w:pPr>
+              <w:widowControl/>
+              <w:jc w:val="center"/>
+              <w:rPr>
+                <w:rFonts w:ascii="Times New Roman" w:hAnsi="Times New Roman" w:cs="Times New Roman"/>
+                <w:sz w:val="22"/>
+                <w:szCs w:val="22"/>
+              </w:rPr>
+            </w:pPr>
+            <w:r>
+              <w:rPr>
+                <w:rFonts w:ascii="Times New Roman" w:eastAsia="Yu Gothic" w:hAnsi="Times New Roman" w:cs="Times New Roman"/>
+                <w:color w:val="000000"/>
+                <w:sz w:val="22"/>
+                <w:szCs w:val="22"/>
+              </w:rPr>
+              <w:t>109 (49.1%)</w:t>
+            </w:r>
+          </w:p>
+        </w:tc>
+        <w:tc>
+          <w:tcPr>
+            <w:tcW w:w="1738" w:type="dxa"/>
+            <w:tcBorders>
+              <w:top w:val="single" w:sz="4" w:space="0" w:color="auto"/>
+            </w:tcBorders>
+            <w:vAlign w:val="center"/>
+          </w:tcPr>
+          <w:p>
+            <w:pPr>
+              <w:widowControl/>
+              <w:jc w:val="center"/>
+              <w:rPr>
+                <w:rFonts w:ascii="Times New Roman" w:hAnsi="Times New Roman" w:cs="Times New Roman"/>
+                <w:sz w:val="22"/>
+                <w:szCs w:val="22"/>
+              </w:rPr>
+            </w:pPr>
+            <w:r>
+              <w:rPr>
+                <w:rFonts w:ascii="Times New Roman" w:eastAsia="Yu Gothic" w:hAnsi="Times New Roman" w:cs="Times New Roman"/>
+                <w:color w:val="000000"/>
+                <w:sz w:val="22"/>
+                <w:szCs w:val="22"/>
+              </w:rPr>
+              <w:t>109 (0.2%)</w:t>
+            </w:r>
+          </w:p>
+        </w:tc>
+      </w:tr>
+      <w:tr>
+        <w:tc>
+          <w:tcPr>
+            <w:tcW w:w="1844" w:type="dxa"/>
+            <w:vAlign w:val="center"/>
+          </w:tcPr>
+          <w:p>
+            <w:pPr>
+              <w:widowControl/>
+              <w:jc w:val="left"/>
+              <w:rPr>
+                <w:rFonts w:ascii="Times New Roman" w:hAnsi="Times New Roman" w:cs="Times New Roman"/>
+                <w:sz w:val="22"/>
+                <w:szCs w:val="22"/>
+              </w:rPr>
+            </w:pPr>
+            <w:r>
+              <w:rPr>
+                <w:rFonts w:ascii="Times New Roman" w:eastAsia="Yu Gothic" w:hAnsi="Times New Roman" w:cs="Times New Roman"/>
+                <w:color w:val="000000"/>
+                <w:sz w:val="22"/>
+                <w:szCs w:val="22"/>
+              </w:rPr>
+              <w:t>Cardiac rhythm</w:t>
+            </w:r>
+          </w:p>
+        </w:tc>
+        <w:tc>
+          <w:tcPr>
+            <w:tcW w:w="2546" w:type="dxa"/>
+            <w:vAlign w:val="center"/>
+          </w:tcPr>
+          <w:p>
+            <w:pPr>
+              <w:widowControl/>
+              <w:jc w:val="left"/>
+              <w:rPr>
+                <w:rFonts w:ascii="Times New Roman" w:hAnsi="Times New Roman" w:cs="Times New Roman"/>
+                <w:sz w:val="22"/>
+                <w:szCs w:val="22"/>
+              </w:rPr>
+            </w:pPr>
+            <w:r>
+              <w:rPr>
+                <w:rFonts w:ascii="Times New Roman" w:eastAsia="Yu Gothic" w:hAnsi="Times New Roman" w:cs="Times New Roman"/>
+                <w:color w:val="000000"/>
+                <w:sz w:val="22"/>
+                <w:szCs w:val="22"/>
+              </w:rPr>
+              <w:t>Ventricular tachycardia</w:t>
+            </w:r>
+          </w:p>
+        </w:tc>
+        <w:tc>
+          <w:tcPr>
+            <w:tcW w:w="1737" w:type="dxa"/>
+            <w:vAlign w:val="center"/>
+          </w:tcPr>
+          <w:p>
+            <w:pPr>
+              <w:widowControl/>
+              <w:jc w:val="center"/>
+              <w:rPr>
+                <w:rFonts w:ascii="Times New Roman" w:hAnsi="Times New Roman" w:cs="Times New Roman"/>
+                <w:sz w:val="22"/>
+                <w:szCs w:val="22"/>
+              </w:rPr>
+            </w:pPr>
+            <w:r>
+              <w:rPr>
+                <w:rFonts w:ascii="Times New Roman" w:eastAsia="Yu Gothic" w:hAnsi="Times New Roman" w:cs="Times New Roman"/>
+                <w:color w:val="000000"/>
+                <w:sz w:val="22"/>
+                <w:szCs w:val="22"/>
+              </w:rPr>
+              <w:t>—</w:t>
+            </w:r>
+          </w:p>
+        </w:tc>
+        <w:tc>
+          <w:tcPr>
+            <w:tcW w:w="1738" w:type="dxa"/>
+            <w:vAlign w:val="center"/>
+          </w:tcPr>
+          <w:p>
+            <w:pPr>
+              <w:widowControl/>
+              <w:jc w:val="center"/>
+              <w:rPr>
+                <w:rFonts w:ascii="Times New Roman" w:hAnsi="Times New Roman" w:cs="Times New Roman"/>
+                <w:sz w:val="22"/>
+                <w:szCs w:val="22"/>
+              </w:rPr>
+            </w:pPr>
+            <w:r>
+              <w:rPr>
+                <w:rFonts w:ascii="Times New Roman" w:eastAsia="Yu Gothic" w:hAnsi="Times New Roman" w:cs="Times New Roman"/>
+                <w:color w:val="000000"/>
+                <w:sz w:val="22"/>
+                <w:szCs w:val="22"/>
+              </w:rPr>
+              <w:t>—</w:t>
+            </w:r>
+          </w:p>
+        </w:tc>
+        <w:tc>
+          <w:tcPr>
+            <w:tcW w:w="1738" w:type="dxa"/>
+            <w:vAlign w:val="center"/>
+          </w:tcPr>
+          <w:p>
+            <w:pPr>
+              <w:widowControl/>
+              <w:jc w:val="center"/>
+              <w:rPr>
+                <w:rFonts w:ascii="Times New Roman" w:hAnsi="Times New Roman" w:cs="Times New Roman"/>
+                <w:sz w:val="22"/>
+                <w:szCs w:val="22"/>
+              </w:rPr>
+            </w:pPr>
+            <w:r>
+              <w:rPr>
+                <w:rFonts w:ascii="Times New Roman" w:eastAsia="Yu Gothic" w:hAnsi="Times New Roman" w:cs="Times New Roman"/>
+                <w:color w:val="000000"/>
+                <w:sz w:val="22"/>
+                <w:szCs w:val="22"/>
+              </w:rPr>
+              <w:t>69 (31.1%)</w:t>
+            </w:r>
+          </w:p>
+        </w:tc>
+        <w:tc>
+          <w:tcPr>
+            <w:tcW w:w="1738" w:type="dxa"/>
+            <w:vAlign w:val="center"/>
+          </w:tcPr>
+          <w:p>
+            <w:pPr>
+              <w:widowControl/>
+              <w:jc w:val="center"/>
+              <w:rPr>
+                <w:rFonts w:ascii="Times New Roman" w:hAnsi="Times New Roman" w:cs="Times New Roman"/>
+                <w:sz w:val="22"/>
+                <w:szCs w:val="22"/>
+              </w:rPr>
+            </w:pPr>
+            <w:r>
+              <w:rPr>
+                <w:rFonts w:ascii="Times New Roman" w:eastAsia="Yu Gothic" w:hAnsi="Times New Roman" w:cs="Times New Roman"/>
+                <w:color w:val="000000"/>
+                <w:sz w:val="22"/>
+                <w:szCs w:val="22"/>
+              </w:rPr>
+              <w:t>69 (0.1%)</w:t>
+            </w:r>
+          </w:p>
+        </w:tc>
+      </w:tr>
+      <w:tr>
+        <w:tc>
+          <w:tcPr>
+            <w:tcW w:w="1844" w:type="dxa"/>
+            <w:vAlign w:val="center"/>
+          </w:tcPr>
+          <w:p>
+            <w:pPr>
+              <w:widowControl/>
+              <w:jc w:val="left"/>
+              <w:rPr>
+                <w:rFonts w:ascii="Times New Roman" w:hAnsi="Times New Roman" w:cs="Times New Roman"/>
+                <w:sz w:val="22"/>
+                <w:szCs w:val="22"/>
+              </w:rPr>
+            </w:pPr>
+            <w:r>
+              <w:rPr>
+                <w:rFonts w:ascii="Times New Roman" w:eastAsia="Yu Gothic" w:hAnsi="Times New Roman" w:cs="Times New Roman"/>
+                <w:color w:val="000000"/>
+                <w:sz w:val="22"/>
+                <w:szCs w:val="22"/>
+              </w:rPr>
+              <w:t>Cardiac rhythm</w:t>
+            </w:r>
+          </w:p>
+        </w:tc>
+        <w:tc>
+          <w:tcPr>
+            <w:tcW w:w="2546" w:type="dxa"/>
+            <w:vAlign w:val="center"/>
+          </w:tcPr>
+          <w:p>
+            <w:pPr>
+              <w:widowControl/>
+              <w:jc w:val="left"/>
+              <w:rPr>
+                <w:rFonts w:ascii="Times New Roman" w:hAnsi="Times New Roman" w:cs="Times New Roman"/>
+                <w:sz w:val="22"/>
+                <w:szCs w:val="22"/>
+              </w:rPr>
+            </w:pPr>
+            <w:r>
+              <w:rPr>
+                <w:rFonts w:ascii="Times New Roman" w:eastAsia="Yu Gothic" w:hAnsi="Times New Roman" w:cs="Times New Roman"/>
+                <w:color w:val="000000"/>
+                <w:sz w:val="22"/>
+                <w:szCs w:val="22"/>
+              </w:rPr>
+              <w:t>Asystole</w:t>
+            </w:r>
+          </w:p>
+        </w:tc>
+        <w:tc>
+          <w:tcPr>
+            <w:tcW w:w="1737" w:type="dxa"/>
+            <w:vAlign w:val="center"/>
+          </w:tcPr>
+          <w:p>
+            <w:pPr>
+              <w:widowControl/>
+              <w:jc w:val="center"/>
+              <w:rPr>
+                <w:rFonts w:ascii="Times New Roman" w:hAnsi="Times New Roman" w:cs="Times New Roman"/>
+                <w:sz w:val="22"/>
+                <w:szCs w:val="22"/>
+              </w:rPr>
+            </w:pPr>
+            <w:r>
+              <w:rPr>
+                <w:rFonts w:ascii="Times New Roman" w:eastAsia="Yu Gothic" w:hAnsi="Times New Roman" w:cs="Times New Roman"/>
+                <w:color w:val="000000"/>
+                <w:sz w:val="22"/>
+                <w:szCs w:val="22"/>
+              </w:rPr>
+              <w:t>—</w:t>
+            </w:r>
+          </w:p>
+        </w:tc>
+        <w:tc>
+          <w:tcPr>
+            <w:tcW w:w="1738" w:type="dxa"/>
+            <w:vAlign w:val="center"/>
+          </w:tcPr>
+          <w:p>
+            <w:pPr>
+              <w:widowControl/>
+              <w:jc w:val="center"/>
+              <w:rPr>
+                <w:rFonts w:ascii="Times New Roman" w:hAnsi="Times New Roman" w:cs="Times New Roman"/>
+                <w:sz w:val="22"/>
+                <w:szCs w:val="22"/>
+              </w:rPr>
+            </w:pPr>
+            <w:r>
+              <w:rPr>
+                <w:rFonts w:ascii="Times New Roman" w:eastAsia="Yu Gothic" w:hAnsi="Times New Roman" w:cs="Times New Roman"/>
+                <w:color w:val="000000"/>
+                <w:sz w:val="22"/>
+                <w:szCs w:val="22"/>
+              </w:rPr>
+              <w:t>—</w:t>
+            </w:r>
+          </w:p>
+        </w:tc>
+        <w:tc>
+          <w:tcPr>
+            <w:tcW w:w="1738" w:type="dxa"/>
+            <w:vAlign w:val="center"/>
+          </w:tcPr>
+          <w:p>
+            <w:pPr>
+              <w:widowControl/>
+              <w:jc w:val="center"/>
+              <w:rPr>
+                <w:rFonts w:ascii="Times New Roman" w:hAnsi="Times New Roman" w:cs="Times New Roman"/>
+                <w:sz w:val="22"/>
+                <w:szCs w:val="22"/>
+              </w:rPr>
+            </w:pPr>
+            <w:r>
+              <w:rPr>
+                <w:rFonts w:ascii="Times New Roman" w:eastAsia="Yu Gothic" w:hAnsi="Times New Roman" w:cs="Times New Roman"/>
+                <w:color w:val="000000"/>
+                <w:sz w:val="22"/>
+                <w:szCs w:val="22"/>
+              </w:rPr>
+              <w:t>44 (19.8%)</w:t>
+            </w:r>
+          </w:p>
+        </w:tc>
+        <w:tc>
+          <w:tcPr>
+            <w:tcW w:w="1738" w:type="dxa"/>
+            <w:vAlign w:val="center"/>
+          </w:tcPr>
+          <w:p>
+            <w:pPr>
+              <w:widowControl/>
+              <w:jc w:val="center"/>
+              <w:rPr>
+                <w:rFonts w:ascii="Times New Roman" w:hAnsi="Times New Roman" w:cs="Times New Roman"/>
+                <w:sz w:val="22"/>
+                <w:szCs w:val="22"/>
+              </w:rPr>
+            </w:pPr>
+            <w:r>
+              <w:rPr>
+                <w:rFonts w:ascii="Times New Roman" w:eastAsia="Yu Gothic" w:hAnsi="Times New Roman" w:cs="Times New Roman"/>
+                <w:color w:val="000000"/>
+                <w:sz w:val="22"/>
+                <w:szCs w:val="22"/>
+              </w:rPr>
+              <w:t>44 (0.1%)</w:t>
+            </w:r>
+          </w:p>
+        </w:tc>
+      </w:tr>
+      <w:tr>
+        <w:tc>
+          <w:tcPr>
+            <w:tcW w:w="1844" w:type="dxa"/>
+            <w:vAlign w:val="center"/>
+          </w:tcPr>
+          <w:p>
+            <w:pPr>
+              <w:widowControl/>
+              <w:jc w:val="left"/>
+              <w:rPr>
+                <w:rFonts w:ascii="Times New Roman" w:hAnsi="Times New Roman" w:cs="Times New Roman"/>
+                <w:sz w:val="22"/>
+                <w:szCs w:val="22"/>
+              </w:rPr>
+            </w:pPr>
+            <w:r>
+              <w:rPr>
+                <w:rFonts w:ascii="Times New Roman" w:eastAsia="Yu Gothic" w:hAnsi="Times New Roman" w:cs="Times New Roman"/>
+                <w:color w:val="000000"/>
+                <w:sz w:val="22"/>
+                <w:szCs w:val="22"/>
+              </w:rPr>
+              <w:t>Cardiac rhythm</w:t>
+            </w:r>
+          </w:p>
+        </w:tc>
+        <w:tc>
+          <w:tcPr>
+            <w:tcW w:w="2546" w:type="dxa"/>
+            <w:vAlign w:val="center"/>
+          </w:tcPr>
+          <w:p>
+            <w:pPr>
+              <w:widowControl/>
+              <w:jc w:val="left"/>
+              <w:rPr>
+                <w:rFonts w:ascii="Times New Roman" w:hAnsi="Times New Roman" w:cs="Times New Roman"/>
+                <w:sz w:val="22"/>
+                <w:szCs w:val="22"/>
+              </w:rPr>
+            </w:pPr>
+            <w:r>
+              <w:rPr>
+                <w:rFonts w:ascii="Times New Roman" w:eastAsia="Yu Gothic" w:hAnsi="Times New Roman" w:cs="Times New Roman"/>
+                <w:color w:val="000000"/>
+                <w:sz w:val="22"/>
+                <w:szCs w:val="22"/>
+              </w:rPr>
+              <w:t>VPC Run</w:t>
+            </w:r>
+          </w:p>
+        </w:tc>
+        <w:tc>
+          <w:tcPr>
+            <w:tcW w:w="1737" w:type="dxa"/>
+            <w:vAlign w:val="center"/>
+          </w:tcPr>
+          <w:p>
+            <w:pPr>
+              <w:widowControl/>
+              <w:jc w:val="center"/>
+              <w:rPr>
+                <w:rFonts w:ascii="Times New Roman" w:hAnsi="Times New Roman" w:cs="Times New Roman"/>
+                <w:sz w:val="22"/>
+                <w:szCs w:val="22"/>
+              </w:rPr>
+            </w:pPr>
+            <w:r>
+              <w:rPr>
+                <w:rFonts w:ascii="Times New Roman" w:eastAsia="Yu Gothic" w:hAnsi="Times New Roman" w:cs="Times New Roman"/>
+                <w:color w:val="000000"/>
+                <w:sz w:val="22"/>
+                <w:szCs w:val="22"/>
+              </w:rPr>
+              <w:t>1574 (95.5%)</w:t>
+            </w:r>
+          </w:p>
+        </w:tc>
+        <w:tc>
+          <w:tcPr>
+            <w:tcW w:w="1738" w:type="dxa"/>
+            <w:vAlign w:val="center"/>
+          </w:tcPr>
+          <w:p>
+            <w:pPr>
+              <w:widowControl/>
+              <w:jc w:val="center"/>
+              <w:rPr>
+                <w:rFonts w:ascii="Times New Roman" w:hAnsi="Times New Roman" w:cs="Times New Roman"/>
+                <w:sz w:val="22"/>
+                <w:szCs w:val="22"/>
+              </w:rPr>
+            </w:pPr>
+            <w:r>
+              <w:rPr>
+                <w:rFonts w:ascii="Times New Roman" w:eastAsia="Yu Gothic" w:hAnsi="Times New Roman" w:cs="Times New Roman"/>
+                <w:color w:val="000000"/>
+                <w:sz w:val="22"/>
+                <w:szCs w:val="22"/>
+              </w:rPr>
+              <w:t>—</w:t>
+            </w:r>
+          </w:p>
+        </w:tc>
+        <w:tc>
+          <w:tcPr>
+            <w:tcW w:w="1738" w:type="dxa"/>
+            <w:vAlign w:val="center"/>
+          </w:tcPr>
+          <w:p>
+            <w:pPr>
+              <w:widowControl/>
+              <w:jc w:val="center"/>
+              <w:rPr>
+                <w:rFonts w:ascii="Times New Roman" w:hAnsi="Times New Roman" w:cs="Times New Roman"/>
+                <w:sz w:val="22"/>
+                <w:szCs w:val="22"/>
+              </w:rPr>
+            </w:pPr>
+            <w:r>
+              <w:rPr>
+                <w:rFonts w:ascii="Times New Roman" w:eastAsia="Yu Gothic" w:hAnsi="Times New Roman" w:cs="Times New Roman"/>
+                <w:color w:val="000000"/>
+                <w:sz w:val="22"/>
+                <w:szCs w:val="22"/>
+              </w:rPr>
+              <w:t>—</w:t>
+            </w:r>
+          </w:p>
+        </w:tc>
+        <w:tc>
+          <w:tcPr>
+            <w:tcW w:w="1738" w:type="dxa"/>
+            <w:vAlign w:val="center"/>
+          </w:tcPr>
+          <w:p>
+            <w:pPr>
+              <w:widowControl/>
+              <w:jc w:val="center"/>
+              <w:rPr>
+                <w:rFonts w:ascii="Times New Roman" w:hAnsi="Times New Roman" w:cs="Times New Roman"/>
+                <w:sz w:val="22"/>
+                <w:szCs w:val="22"/>
+              </w:rPr>
+            </w:pPr>
+            <w:r>
+              <w:rPr>
+                <w:rFonts w:ascii="Times New Roman" w:eastAsia="Yu Gothic" w:hAnsi="Times New Roman" w:cs="Times New Roman"/>
+                <w:color w:val="000000"/>
+                <w:sz w:val="22"/>
+                <w:szCs w:val="22"/>
+              </w:rPr>
+              <w:t>1574 (2.7%)</w:t>
+            </w:r>
+          </w:p>
+        </w:tc>
+      </w:tr>
+      <w:tr>
+        <w:tc>
+          <w:tcPr>
+            <w:tcW w:w="1844" w:type="dxa"/>
+            <w:vAlign w:val="center"/>
+          </w:tcPr>
+          <w:p>
+            <w:pPr>
+              <w:widowControl/>
+              <w:jc w:val="left"/>
+              <w:rPr>
+                <w:rFonts w:ascii="Times New Roman" w:hAnsi="Times New Roman" w:cs="Times New Roman"/>
+                <w:sz w:val="22"/>
+                <w:szCs w:val="22"/>
+              </w:rPr>
+            </w:pPr>
+            <w:r>
+              <w:rPr>
+                <w:rFonts w:ascii="Times New Roman" w:eastAsia="Yu Gothic" w:hAnsi="Times New Roman" w:cs="Times New Roman"/>
+                <w:color w:val="000000"/>
+                <w:sz w:val="22"/>
+                <w:szCs w:val="22"/>
+              </w:rPr>
+              <w:t>Cardiac rhythm</w:t>
+            </w:r>
+          </w:p>
+        </w:tc>
+        <w:tc>
+          <w:tcPr>
+            <w:tcW w:w="2546" w:type="dxa"/>
+            <w:vAlign w:val="center"/>
+          </w:tcPr>
+          <w:p>
+            <w:pPr>
+              <w:widowControl/>
+              <w:jc w:val="left"/>
+              <w:rPr>
+                <w:rFonts w:ascii="Times New Roman" w:hAnsi="Times New Roman" w:cs="Times New Roman"/>
+                <w:sz w:val="22"/>
+                <w:szCs w:val="22"/>
+              </w:rPr>
+            </w:pPr>
+            <w:r>
+              <w:rPr>
+                <w:rFonts w:ascii="Times New Roman" w:eastAsia="Yu Gothic" w:hAnsi="Times New Roman" w:cs="Times New Roman"/>
+                <w:color w:val="000000"/>
+                <w:sz w:val="22"/>
+                <w:szCs w:val="22"/>
+              </w:rPr>
+              <w:t>Tachycardia</w:t>
+            </w:r>
+          </w:p>
+        </w:tc>
+        <w:tc>
+          <w:tcPr>
+            <w:tcW w:w="1737" w:type="dxa"/>
+            <w:vAlign w:val="center"/>
+          </w:tcPr>
+          <w:p>
+            <w:pPr>
+              <w:widowControl/>
+              <w:jc w:val="center"/>
+              <w:rPr>
+                <w:rFonts w:ascii="Times New Roman" w:hAnsi="Times New Roman" w:cs="Times New Roman"/>
+                <w:sz w:val="22"/>
+                <w:szCs w:val="22"/>
+              </w:rPr>
+            </w:pPr>
+            <w:r>
+              <w:rPr>
+                <w:rFonts w:ascii="Times New Roman" w:eastAsia="Yu Gothic" w:hAnsi="Times New Roman" w:cs="Times New Roman"/>
+                <w:color w:val="000000"/>
+                <w:sz w:val="22"/>
+                <w:szCs w:val="22"/>
+              </w:rPr>
+              <w:t>—</w:t>
+            </w:r>
+          </w:p>
+        </w:tc>
+        <w:tc>
+          <w:tcPr>
+            <w:tcW w:w="1738" w:type="dxa"/>
+            <w:vAlign w:val="center"/>
+          </w:tcPr>
+          <w:p>
+            <w:pPr>
+              <w:widowControl/>
+              <w:jc w:val="center"/>
+              <w:rPr>
+                <w:rFonts w:ascii="Times New Roman" w:hAnsi="Times New Roman" w:cs="Times New Roman"/>
+                <w:sz w:val="22"/>
+                <w:szCs w:val="22"/>
+              </w:rPr>
+            </w:pPr>
+            <w:r>
+              <w:rPr>
+                <w:rFonts w:ascii="Times New Roman" w:eastAsia="Yu Gothic" w:hAnsi="Times New Roman" w:cs="Times New Roman"/>
+                <w:color w:val="000000"/>
+                <w:sz w:val="22"/>
+                <w:szCs w:val="22"/>
+              </w:rPr>
+              <w:t>8022 (14.0%)</w:t>
+            </w:r>
+          </w:p>
+        </w:tc>
+        <w:tc>
+          <w:tcPr>
+            <w:tcW w:w="1738" w:type="dxa"/>
+            <w:vAlign w:val="center"/>
+          </w:tcPr>
+          <w:p>
+            <w:pPr>
+              <w:widowControl/>
+              <w:jc w:val="center"/>
+              <w:rPr>
+                <w:rFonts w:ascii="Times New Roman" w:hAnsi="Times New Roman" w:cs="Times New Roman"/>
+                <w:sz w:val="22"/>
+                <w:szCs w:val="22"/>
+              </w:rPr>
+            </w:pPr>
+            <w:r>
+              <w:rPr>
+                <w:rFonts w:ascii="Times New Roman" w:eastAsia="Yu Gothic" w:hAnsi="Times New Roman" w:cs="Times New Roman"/>
+                <w:color w:val="000000"/>
+                <w:sz w:val="22"/>
+                <w:szCs w:val="22"/>
+              </w:rPr>
+              <w:t>—</w:t>
+            </w:r>
+          </w:p>
+        </w:tc>
+        <w:tc>
+          <w:tcPr>
+            <w:tcW w:w="1738" w:type="dxa"/>
+            <w:vAlign w:val="center"/>
+          </w:tcPr>
+          <w:p>
+            <w:pPr>
+              <w:widowControl/>
+              <w:jc w:val="center"/>
+              <w:rPr>
+                <w:rFonts w:ascii="Times New Roman" w:hAnsi="Times New Roman" w:cs="Times New Roman"/>
+                <w:sz w:val="22"/>
+                <w:szCs w:val="22"/>
+              </w:rPr>
+            </w:pPr>
+            <w:r>
+              <w:rPr>
+                <w:rFonts w:ascii="Times New Roman" w:eastAsia="Yu Gothic" w:hAnsi="Times New Roman" w:cs="Times New Roman"/>
+                <w:color w:val="000000"/>
+                <w:sz w:val="22"/>
+                <w:szCs w:val="22"/>
+              </w:rPr>
+              <w:t>8022 (13.6%)</w:t>
+            </w:r>
+          </w:p>
+        </w:tc>
+      </w:tr>
+      <w:tr>
+        <w:tc>
+          <w:tcPr>
+            <w:tcW w:w="1844" w:type="dxa"/>
+            <w:vAlign w:val="center"/>
+          </w:tcPr>
+          <w:p>
+            <w:pPr>
+              <w:widowControl/>
+              <w:jc w:val="left"/>
+              <w:rPr>
+                <w:rFonts w:ascii="Times New Roman" w:hAnsi="Times New Roman" w:cs="Times New Roman"/>
+                <w:sz w:val="22"/>
+                <w:szCs w:val="22"/>
+              </w:rPr>
+            </w:pPr>
+            <w:r>
+              <w:rPr>
+                <w:rFonts w:ascii="Times New Roman" w:eastAsia="Yu Gothic" w:hAnsi="Times New Roman" w:cs="Times New Roman"/>
+                <w:color w:val="000000"/>
+                <w:sz w:val="22"/>
+                <w:szCs w:val="22"/>
+              </w:rPr>
+              <w:t>Cardiac rhythm</w:t>
+            </w:r>
+          </w:p>
+        </w:tc>
+        <w:tc>
+          <w:tcPr>
+            <w:tcW w:w="2546" w:type="dxa"/>
+            <w:vAlign w:val="center"/>
+          </w:tcPr>
+          <w:p>
+            <w:pPr>
+              <w:widowControl/>
+              <w:jc w:val="left"/>
+              <w:rPr>
+                <w:rFonts w:ascii="Times New Roman" w:hAnsi="Times New Roman" w:cs="Times New Roman" w:hint="eastAsia"/>
+                <w:sz w:val="22"/>
+                <w:szCs w:val="22"/>
+              </w:rPr>
+            </w:pPr>
+            <w:r>
+              <w:rPr>
+                <w:rFonts w:ascii="Times New Roman" w:eastAsia="Yu Gothic" w:hAnsi="Times New Roman" w:cs="Times New Roman"/>
+                <w:color w:val="000000"/>
+                <w:sz w:val="22"/>
+                <w:szCs w:val="22"/>
+              </w:rPr>
+              <w:t>Bradycardia</w:t>
+            </w:r>
+          </w:p>
+        </w:tc>
+        <w:tc>
+          <w:tcPr>
+            <w:tcW w:w="1737" w:type="dxa"/>
+            <w:vAlign w:val="center"/>
+          </w:tcPr>
+          <w:p>
+            <w:pPr>
+              <w:widowControl/>
+              <w:jc w:val="center"/>
+              <w:rPr>
+                <w:rFonts w:ascii="Times New Roman" w:hAnsi="Times New Roman" w:cs="Times New Roman"/>
+                <w:sz w:val="22"/>
+                <w:szCs w:val="22"/>
+              </w:rPr>
+            </w:pPr>
+            <w:r>
+              <w:rPr>
+                <w:rFonts w:ascii="Times New Roman" w:eastAsia="Yu Gothic" w:hAnsi="Times New Roman" w:cs="Times New Roman"/>
+                <w:color w:val="000000"/>
+                <w:sz w:val="22"/>
+                <w:szCs w:val="22"/>
+              </w:rPr>
+              <w:t>—</w:t>
+            </w:r>
+          </w:p>
+        </w:tc>
+        <w:tc>
+          <w:tcPr>
+            <w:tcW w:w="1738" w:type="dxa"/>
+            <w:vAlign w:val="center"/>
+          </w:tcPr>
+          <w:p>
+            <w:pPr>
+              <w:widowControl/>
+              <w:jc w:val="center"/>
+              <w:rPr>
+                <w:rFonts w:ascii="Times New Roman" w:hAnsi="Times New Roman" w:cs="Times New Roman"/>
+                <w:sz w:val="22"/>
+                <w:szCs w:val="22"/>
+              </w:rPr>
+            </w:pPr>
+            <w:r>
+              <w:rPr>
+                <w:rFonts w:ascii="Times New Roman" w:eastAsia="Yu Gothic" w:hAnsi="Times New Roman" w:cs="Times New Roman"/>
+                <w:color w:val="000000"/>
+                <w:sz w:val="22"/>
+                <w:szCs w:val="22"/>
+              </w:rPr>
+              <w:t>979 (1.7%)</w:t>
+            </w:r>
+          </w:p>
+        </w:tc>
+        <w:tc>
+          <w:tcPr>
+            <w:tcW w:w="1738" w:type="dxa"/>
+            <w:vAlign w:val="center"/>
+          </w:tcPr>
+          <w:p>
+            <w:pPr>
+              <w:widowControl/>
+              <w:jc w:val="center"/>
+              <w:rPr>
+                <w:rFonts w:ascii="Times New Roman" w:hAnsi="Times New Roman" w:cs="Times New Roman"/>
+                <w:sz w:val="22"/>
+                <w:szCs w:val="22"/>
+              </w:rPr>
+            </w:pPr>
+            <w:r>
+              <w:rPr>
+                <w:rFonts w:ascii="Times New Roman" w:eastAsia="Yu Gothic" w:hAnsi="Times New Roman" w:cs="Times New Roman"/>
+                <w:color w:val="000000"/>
+                <w:sz w:val="22"/>
+                <w:szCs w:val="22"/>
+              </w:rPr>
+              <w:t>—</w:t>
+            </w:r>
+          </w:p>
+        </w:tc>
+        <w:tc>
+          <w:tcPr>
+            <w:tcW w:w="1738" w:type="dxa"/>
+            <w:vAlign w:val="center"/>
+          </w:tcPr>
+          <w:p>
+            <w:pPr>
+              <w:widowControl/>
+              <w:jc w:val="center"/>
+              <w:rPr>
+                <w:rFonts w:ascii="Times New Roman" w:hAnsi="Times New Roman" w:cs="Times New Roman"/>
+                <w:sz w:val="22"/>
+                <w:szCs w:val="22"/>
+              </w:rPr>
+            </w:pPr>
+            <w:r>
+              <w:rPr>
+                <w:rFonts w:ascii="Times New Roman" w:eastAsia="Yu Gothic" w:hAnsi="Times New Roman" w:cs="Times New Roman"/>
+                <w:color w:val="000000"/>
+                <w:sz w:val="22"/>
+                <w:szCs w:val="22"/>
+              </w:rPr>
+              <w:t>979 (1.7%)</w:t>
+            </w:r>
+          </w:p>
+        </w:tc>
+      </w:tr>
+      <w:tr>
+        <w:tc>
+          <w:tcPr>
+            <w:tcW w:w="1844" w:type="dxa"/>
+            <w:vAlign w:val="center"/>
+          </w:tcPr>
+          <w:p>
+            <w:pPr>
+              <w:widowControl/>
+              <w:jc w:val="left"/>
+              <w:rPr>
+                <w:rFonts w:ascii="Times New Roman" w:hAnsi="Times New Roman" w:cs="Times New Roman"/>
+                <w:sz w:val="22"/>
+                <w:szCs w:val="22"/>
+              </w:rPr>
+            </w:pPr>
+            <w:r>
+              <w:rPr>
+                <w:rFonts w:ascii="Times New Roman" w:eastAsia="Yu Gothic" w:hAnsi="Times New Roman" w:cs="Times New Roman"/>
+                <w:color w:val="000000"/>
+                <w:sz w:val="22"/>
+                <w:szCs w:val="22"/>
+              </w:rPr>
+              <w:t>Cardiac rhythm</w:t>
+            </w:r>
+          </w:p>
+        </w:tc>
+        <w:tc>
+          <w:tcPr>
+            <w:tcW w:w="2546" w:type="dxa"/>
+            <w:vAlign w:val="center"/>
+          </w:tcPr>
+          <w:p>
+            <w:pPr>
+              <w:widowControl/>
+              <w:jc w:val="left"/>
+              <w:rPr>
+                <w:rFonts w:ascii="Times New Roman" w:hAnsi="Times New Roman" w:cs="Times New Roman"/>
+                <w:sz w:val="22"/>
+                <w:szCs w:val="22"/>
+              </w:rPr>
+            </w:pPr>
+            <w:r>
+              <w:rPr>
+                <w:rFonts w:ascii="Times New Roman" w:eastAsia="Yu Gothic" w:hAnsi="Times New Roman" w:cs="Times New Roman"/>
+                <w:color w:val="000000"/>
+                <w:sz w:val="22"/>
+                <w:szCs w:val="22"/>
+              </w:rPr>
+              <w:t>Pulse rate (via SpO2)</w:t>
+            </w:r>
+          </w:p>
+        </w:tc>
+        <w:tc>
+          <w:tcPr>
+            <w:tcW w:w="1737" w:type="dxa"/>
+            <w:vAlign w:val="center"/>
+          </w:tcPr>
+          <w:p>
+            <w:pPr>
+              <w:widowControl/>
+              <w:jc w:val="center"/>
+              <w:rPr>
+                <w:rFonts w:ascii="Times New Roman" w:hAnsi="Times New Roman" w:cs="Times New Roman"/>
+                <w:sz w:val="22"/>
+                <w:szCs w:val="22"/>
+              </w:rPr>
+            </w:pPr>
+            <w:r>
+              <w:rPr>
+                <w:rFonts w:ascii="Times New Roman" w:eastAsia="Yu Gothic" w:hAnsi="Times New Roman" w:cs="Times New Roman"/>
+                <w:color w:val="000000"/>
+                <w:sz w:val="22"/>
+                <w:szCs w:val="22"/>
+              </w:rPr>
+              <w:t>—</w:t>
+            </w:r>
+          </w:p>
+        </w:tc>
+        <w:tc>
+          <w:tcPr>
+            <w:tcW w:w="1738" w:type="dxa"/>
+            <w:vAlign w:val="center"/>
+          </w:tcPr>
+          <w:p>
+            <w:pPr>
+              <w:widowControl/>
+              <w:jc w:val="center"/>
+              <w:rPr>
+                <w:rFonts w:ascii="Times New Roman" w:hAnsi="Times New Roman" w:cs="Times New Roman"/>
+                <w:sz w:val="22"/>
+                <w:szCs w:val="22"/>
+              </w:rPr>
+            </w:pPr>
+            <w:r>
+              <w:rPr>
+                <w:rFonts w:ascii="Times New Roman" w:eastAsia="Yu Gothic" w:hAnsi="Times New Roman" w:cs="Times New Roman"/>
+                <w:color w:val="000000"/>
+                <w:sz w:val="22"/>
+                <w:szCs w:val="22"/>
+              </w:rPr>
+              <w:t>1900 (3.3%)</w:t>
+            </w:r>
+          </w:p>
+        </w:tc>
+        <w:tc>
+          <w:tcPr>
+            <w:tcW w:w="1738" w:type="dxa"/>
+            <w:vAlign w:val="center"/>
+          </w:tcPr>
+          <w:p>
+            <w:pPr>
+              <w:widowControl/>
+              <w:jc w:val="center"/>
+              <w:rPr>
+                <w:rFonts w:ascii="Times New Roman" w:hAnsi="Times New Roman" w:cs="Times New Roman"/>
+                <w:sz w:val="22"/>
+                <w:szCs w:val="22"/>
+              </w:rPr>
+            </w:pPr>
+            <w:r>
+              <w:rPr>
+                <w:rFonts w:ascii="Times New Roman" w:eastAsia="Yu Gothic" w:hAnsi="Times New Roman" w:cs="Times New Roman"/>
+                <w:color w:val="000000"/>
+                <w:sz w:val="22"/>
+                <w:szCs w:val="22"/>
+              </w:rPr>
+              <w:t>—</w:t>
+            </w:r>
+          </w:p>
+        </w:tc>
+        <w:tc>
+          <w:tcPr>
+            <w:tcW w:w="1738" w:type="dxa"/>
+            <w:vAlign w:val="center"/>
+          </w:tcPr>
+          <w:p>
+            <w:pPr>
+              <w:widowControl/>
+              <w:jc w:val="center"/>
+              <w:rPr>
+                <w:rFonts w:ascii="Times New Roman" w:hAnsi="Times New Roman" w:cs="Times New Roman"/>
+                <w:sz w:val="22"/>
+                <w:szCs w:val="22"/>
+              </w:rPr>
+            </w:pPr>
+            <w:r>
+              <w:rPr>
+                <w:rFonts w:ascii="Times New Roman" w:eastAsia="Yu Gothic" w:hAnsi="Times New Roman" w:cs="Times New Roman"/>
+                <w:color w:val="000000"/>
+                <w:sz w:val="22"/>
+                <w:szCs w:val="22"/>
+              </w:rPr>
+              <w:t>1900 (3.2%)</w:t>
+            </w:r>
+          </w:p>
+        </w:tc>
+      </w:tr>
+      <w:tr>
+        <w:tc>
+          <w:tcPr>
+            <w:tcW w:w="1844" w:type="dxa"/>
+            <w:vAlign w:val="center"/>
+          </w:tcPr>
+          <w:p>
+            <w:pPr>
+              <w:widowControl/>
+              <w:jc w:val="left"/>
+              <w:rPr>
+                <w:rFonts w:ascii="Times New Roman" w:hAnsi="Times New Roman" w:cs="Times New Roman"/>
+                <w:sz w:val="22"/>
+                <w:szCs w:val="22"/>
+              </w:rPr>
+            </w:pPr>
+            <w:r>
+              <w:rPr>
+                <w:rFonts w:ascii="Times New Roman" w:eastAsia="Yu Gothic" w:hAnsi="Times New Roman" w:cs="Times New Roman"/>
+                <w:color w:val="000000"/>
+                <w:sz w:val="22"/>
+                <w:szCs w:val="22"/>
+              </w:rPr>
+              <w:t>Oxygenation</w:t>
+            </w:r>
+          </w:p>
+        </w:tc>
+        <w:tc>
+          <w:tcPr>
+            <w:tcW w:w="2546" w:type="dxa"/>
+            <w:vAlign w:val="center"/>
+          </w:tcPr>
+          <w:p>
+            <w:pPr>
+              <w:widowControl/>
+              <w:jc w:val="left"/>
+              <w:rPr>
+                <w:rFonts w:ascii="Times New Roman" w:hAnsi="Times New Roman" w:cs="Times New Roman"/>
+                <w:sz w:val="22"/>
+                <w:szCs w:val="22"/>
+              </w:rPr>
+            </w:pPr>
+            <w:r>
+              <w:rPr>
+                <w:rFonts w:ascii="Times New Roman" w:eastAsia="Yu Gothic" w:hAnsi="Times New Roman" w:cs="Times New Roman"/>
+                <w:color w:val="000000"/>
+                <w:sz w:val="22"/>
+                <w:szCs w:val="22"/>
+              </w:rPr>
+              <w:t>SpO2</w:t>
+            </w:r>
+          </w:p>
+        </w:tc>
+        <w:tc>
+          <w:tcPr>
+            <w:tcW w:w="1737" w:type="dxa"/>
+            <w:vAlign w:val="center"/>
+          </w:tcPr>
+          <w:p>
+            <w:pPr>
+              <w:widowControl/>
+              <w:jc w:val="center"/>
+              <w:rPr>
+                <w:rFonts w:ascii="Times New Roman" w:hAnsi="Times New Roman" w:cs="Times New Roman"/>
+                <w:sz w:val="22"/>
+                <w:szCs w:val="22"/>
+              </w:rPr>
+            </w:pPr>
+            <w:r>
+              <w:rPr>
+                <w:rFonts w:ascii="Times New Roman" w:eastAsia="Yu Gothic" w:hAnsi="Times New Roman" w:cs="Times New Roman"/>
+                <w:color w:val="000000"/>
+                <w:sz w:val="22"/>
+                <w:szCs w:val="22"/>
+              </w:rPr>
+              <w:t>23 (1.4%)</w:t>
+            </w:r>
+          </w:p>
+        </w:tc>
+        <w:tc>
+          <w:tcPr>
+            <w:tcW w:w="1738" w:type="dxa"/>
+            <w:vAlign w:val="center"/>
+          </w:tcPr>
+          <w:p>
+            <w:pPr>
+              <w:widowControl/>
+              <w:jc w:val="center"/>
+              <w:rPr>
+                <w:rFonts w:ascii="Times New Roman" w:hAnsi="Times New Roman" w:cs="Times New Roman"/>
+                <w:sz w:val="22"/>
+                <w:szCs w:val="22"/>
+              </w:rPr>
+            </w:pPr>
+            <w:r>
+              <w:rPr>
+                <w:rFonts w:ascii="Times New Roman" w:eastAsia="Yu Gothic" w:hAnsi="Times New Roman" w:cs="Times New Roman"/>
+                <w:color w:val="000000"/>
+                <w:sz w:val="22"/>
+                <w:szCs w:val="22"/>
+              </w:rPr>
+              <w:t>44413 (77.6%)</w:t>
+            </w:r>
+          </w:p>
+        </w:tc>
+        <w:tc>
+          <w:tcPr>
+            <w:tcW w:w="1738" w:type="dxa"/>
+            <w:vAlign w:val="center"/>
+          </w:tcPr>
+          <w:p>
+            <w:pPr>
+              <w:widowControl/>
+              <w:jc w:val="center"/>
+              <w:rPr>
+                <w:rFonts w:ascii="Times New Roman" w:hAnsi="Times New Roman" w:cs="Times New Roman"/>
+                <w:sz w:val="22"/>
+                <w:szCs w:val="22"/>
+              </w:rPr>
+            </w:pPr>
+            <w:r>
+              <w:rPr>
+                <w:rFonts w:ascii="Times New Roman" w:eastAsia="Yu Gothic" w:hAnsi="Times New Roman" w:cs="Times New Roman"/>
+                <w:color w:val="000000"/>
+                <w:sz w:val="22"/>
+                <w:szCs w:val="22"/>
+              </w:rPr>
+              <w:t>—</w:t>
+            </w:r>
+          </w:p>
+        </w:tc>
+        <w:tc>
+          <w:tcPr>
+            <w:tcW w:w="1738" w:type="dxa"/>
+            <w:vAlign w:val="center"/>
+          </w:tcPr>
+          <w:p>
+            <w:pPr>
+              <w:widowControl/>
+              <w:jc w:val="center"/>
+              <w:rPr>
+                <w:rFonts w:ascii="Times New Roman" w:hAnsi="Times New Roman" w:cs="Times New Roman"/>
+                <w:sz w:val="22"/>
+                <w:szCs w:val="22"/>
+              </w:rPr>
+            </w:pPr>
+            <w:r>
+              <w:rPr>
+                <w:rFonts w:ascii="Times New Roman" w:eastAsia="Yu Gothic" w:hAnsi="Times New Roman" w:cs="Times New Roman"/>
+                <w:color w:val="000000"/>
+                <w:sz w:val="22"/>
+                <w:szCs w:val="22"/>
+              </w:rPr>
+              <w:t>44436 (75.2%)</w:t>
+            </w:r>
+          </w:p>
+        </w:tc>
+      </w:tr>
+      <w:tr>
+        <w:tc>
+          <w:tcPr>
+            <w:tcW w:w="1844" w:type="dxa"/>
+            <w:vAlign w:val="center"/>
+          </w:tcPr>
+          <w:p>
+            <w:pPr>
+              <w:widowControl/>
+              <w:jc w:val="left"/>
+              <w:rPr>
+                <w:rFonts w:ascii="Times New Roman" w:hAnsi="Times New Roman" w:cs="Times New Roman"/>
+                <w:sz w:val="22"/>
+                <w:szCs w:val="22"/>
+              </w:rPr>
+            </w:pPr>
+            <w:r>
+              <w:rPr>
+                <w:rFonts w:ascii="Times New Roman" w:eastAsia="Yu Gothic" w:hAnsi="Times New Roman" w:cs="Times New Roman"/>
+                <w:color w:val="000000"/>
+                <w:sz w:val="22"/>
+                <w:szCs w:val="22"/>
+              </w:rPr>
+              <w:t>Respiratory</w:t>
+            </w:r>
+          </w:p>
+        </w:tc>
+        <w:tc>
+          <w:tcPr>
+            <w:tcW w:w="2546" w:type="dxa"/>
+            <w:vAlign w:val="center"/>
+          </w:tcPr>
+          <w:p>
+            <w:pPr>
+              <w:widowControl/>
+              <w:jc w:val="left"/>
+              <w:rPr>
+                <w:rFonts w:ascii="Times New Roman" w:hAnsi="Times New Roman" w:cs="Times New Roman"/>
+                <w:sz w:val="22"/>
+                <w:szCs w:val="22"/>
+              </w:rPr>
+            </w:pPr>
+            <w:r>
+              <w:rPr>
+                <w:rFonts w:ascii="Times New Roman" w:eastAsia="Yu Gothic" w:hAnsi="Times New Roman" w:cs="Times New Roman"/>
+                <w:color w:val="000000"/>
+                <w:sz w:val="22"/>
+                <w:szCs w:val="22"/>
+              </w:rPr>
+              <w:t>Respiratory rate / Apnea</w:t>
+            </w:r>
+          </w:p>
+        </w:tc>
+        <w:tc>
+          <w:tcPr>
+            <w:tcW w:w="1737" w:type="dxa"/>
+            <w:vAlign w:val="center"/>
+          </w:tcPr>
+          <w:p>
+            <w:pPr>
+              <w:widowControl/>
+              <w:jc w:val="center"/>
+              <w:rPr>
+                <w:rFonts w:ascii="Times New Roman" w:hAnsi="Times New Roman" w:cs="Times New Roman"/>
+                <w:sz w:val="22"/>
+                <w:szCs w:val="22"/>
+              </w:rPr>
+            </w:pPr>
+            <w:r>
+              <w:rPr>
+                <w:rFonts w:ascii="Times New Roman" w:eastAsia="Yu Gothic" w:hAnsi="Times New Roman" w:cs="Times New Roman"/>
+                <w:color w:val="000000"/>
+                <w:sz w:val="22"/>
+                <w:szCs w:val="22"/>
+              </w:rPr>
+              <w:t>—</w:t>
+            </w:r>
+          </w:p>
+        </w:tc>
+        <w:tc>
+          <w:tcPr>
+            <w:tcW w:w="1738" w:type="dxa"/>
+            <w:vAlign w:val="center"/>
+          </w:tcPr>
+          <w:p>
+            <w:pPr>
+              <w:widowControl/>
+              <w:jc w:val="center"/>
+              <w:rPr>
+                <w:rFonts w:ascii="Times New Roman" w:hAnsi="Times New Roman" w:cs="Times New Roman"/>
+                <w:sz w:val="22"/>
+                <w:szCs w:val="22"/>
+              </w:rPr>
+            </w:pPr>
+            <w:r>
+              <w:rPr>
+                <w:rFonts w:ascii="Times New Roman" w:eastAsia="Yu Gothic" w:hAnsi="Times New Roman" w:cs="Times New Roman"/>
+                <w:color w:val="000000"/>
+                <w:sz w:val="22"/>
+                <w:szCs w:val="22"/>
+              </w:rPr>
+              <w:t>1496 (2.6%)</w:t>
+            </w:r>
+          </w:p>
+        </w:tc>
+        <w:tc>
+          <w:tcPr>
+            <w:tcW w:w="1738" w:type="dxa"/>
+            <w:vAlign w:val="center"/>
+          </w:tcPr>
+          <w:p>
+            <w:pPr>
+              <w:widowControl/>
+              <w:jc w:val="center"/>
+              <w:rPr>
+                <w:rFonts w:ascii="Times New Roman" w:hAnsi="Times New Roman" w:cs="Times New Roman"/>
+                <w:sz w:val="22"/>
+                <w:szCs w:val="22"/>
+              </w:rPr>
+            </w:pPr>
+            <w:r>
+              <w:rPr>
+                <w:rFonts w:ascii="Times New Roman" w:eastAsia="Yu Gothic" w:hAnsi="Times New Roman" w:cs="Times New Roman"/>
+                <w:color w:val="000000"/>
+                <w:sz w:val="22"/>
+                <w:szCs w:val="22"/>
+              </w:rPr>
+              <w:t>—</w:t>
+            </w:r>
+          </w:p>
+        </w:tc>
+        <w:tc>
+          <w:tcPr>
+            <w:tcW w:w="1738" w:type="dxa"/>
+            <w:vAlign w:val="center"/>
+          </w:tcPr>
+          <w:p>
+            <w:pPr>
+              <w:widowControl/>
+              <w:jc w:val="center"/>
+              <w:rPr>
+                <w:rFonts w:ascii="Times New Roman" w:hAnsi="Times New Roman" w:cs="Times New Roman"/>
+                <w:sz w:val="22"/>
+                <w:szCs w:val="22"/>
+              </w:rPr>
+            </w:pPr>
+            <w:r>
+              <w:rPr>
+                <w:rFonts w:ascii="Times New Roman" w:eastAsia="Yu Gothic" w:hAnsi="Times New Roman" w:cs="Times New Roman"/>
+                <w:color w:val="000000"/>
+                <w:sz w:val="22"/>
+                <w:szCs w:val="22"/>
+              </w:rPr>
+              <w:t>1496 (2.5%)</w:t>
+            </w:r>
+          </w:p>
+        </w:tc>
+      </w:tr>
+      <w:tr>
+        <w:tc>
+          <w:tcPr>
+            <w:tcW w:w="1844" w:type="dxa"/>
+            <w:vAlign w:val="center"/>
+          </w:tcPr>
+          <w:p>
+            <w:pPr>
+              <w:widowControl/>
+              <w:jc w:val="left"/>
+              <w:rPr>
+                <w:rFonts w:ascii="Times New Roman" w:hAnsi="Times New Roman" w:cs="Times New Roman"/>
+                <w:sz w:val="22"/>
+                <w:szCs w:val="22"/>
+              </w:rPr>
+            </w:pPr>
+            <w:r>
+              <w:rPr>
+                <w:rFonts w:ascii="Times New Roman" w:eastAsia="Yu Gothic" w:hAnsi="Times New Roman" w:cs="Times New Roman"/>
+                <w:color w:val="000000"/>
+                <w:sz w:val="22"/>
+                <w:szCs w:val="22"/>
+              </w:rPr>
+              <w:t>Respiratory</w:t>
+            </w:r>
+          </w:p>
+        </w:tc>
+        <w:tc>
+          <w:tcPr>
+            <w:tcW w:w="2546" w:type="dxa"/>
+            <w:vAlign w:val="center"/>
+          </w:tcPr>
+          <w:p>
+            <w:pPr>
+              <w:widowControl/>
+              <w:jc w:val="left"/>
+              <w:rPr>
+                <w:rFonts w:ascii="Times New Roman" w:hAnsi="Times New Roman" w:cs="Times New Roman"/>
+                <w:sz w:val="22"/>
+                <w:szCs w:val="22"/>
+              </w:rPr>
+            </w:pPr>
+            <w:r>
+              <w:rPr>
+                <w:rFonts w:ascii="Times New Roman" w:eastAsia="Yu Gothic" w:hAnsi="Times New Roman" w:cs="Times New Roman"/>
+                <w:color w:val="000000"/>
+                <w:sz w:val="22"/>
+                <w:szCs w:val="22"/>
+              </w:rPr>
+              <w:t>EtCO2</w:t>
+            </w:r>
+          </w:p>
+        </w:tc>
+        <w:tc>
+          <w:tcPr>
+            <w:tcW w:w="1737" w:type="dxa"/>
+            <w:vAlign w:val="center"/>
+          </w:tcPr>
+          <w:p>
+            <w:pPr>
+              <w:widowControl/>
+              <w:jc w:val="center"/>
+              <w:rPr>
+                <w:rFonts w:ascii="Times New Roman" w:hAnsi="Times New Roman" w:cs="Times New Roman"/>
+                <w:sz w:val="22"/>
+                <w:szCs w:val="22"/>
+              </w:rPr>
+            </w:pPr>
+            <w:r>
+              <w:rPr>
+                <w:rFonts w:ascii="Times New Roman" w:eastAsia="Yu Gothic" w:hAnsi="Times New Roman" w:cs="Times New Roman"/>
+                <w:color w:val="000000"/>
+                <w:sz w:val="22"/>
+                <w:szCs w:val="22"/>
+              </w:rPr>
+              <w:t>1 (0.1%)</w:t>
+            </w:r>
+          </w:p>
+        </w:tc>
+        <w:tc>
+          <w:tcPr>
+            <w:tcW w:w="1738" w:type="dxa"/>
+            <w:vAlign w:val="center"/>
+          </w:tcPr>
+          <w:p>
+            <w:pPr>
+              <w:widowControl/>
+              <w:jc w:val="center"/>
+              <w:rPr>
+                <w:rFonts w:ascii="Times New Roman" w:hAnsi="Times New Roman" w:cs="Times New Roman"/>
+                <w:sz w:val="22"/>
+                <w:szCs w:val="22"/>
+              </w:rPr>
+            </w:pPr>
+            <w:r>
+              <w:rPr>
+                <w:rFonts w:ascii="Times New Roman" w:eastAsia="Yu Gothic" w:hAnsi="Times New Roman" w:cs="Times New Roman"/>
+                <w:color w:val="000000"/>
+                <w:sz w:val="22"/>
+                <w:szCs w:val="22"/>
+              </w:rPr>
+              <w:t>1 (0.0%)</w:t>
+            </w:r>
+          </w:p>
+        </w:tc>
+        <w:tc>
+          <w:tcPr>
+            <w:tcW w:w="1738" w:type="dxa"/>
+            <w:vAlign w:val="center"/>
+          </w:tcPr>
+          <w:p>
+            <w:pPr>
+              <w:widowControl/>
+              <w:jc w:val="center"/>
+              <w:rPr>
+                <w:rFonts w:ascii="Times New Roman" w:hAnsi="Times New Roman" w:cs="Times New Roman"/>
+                <w:sz w:val="22"/>
+                <w:szCs w:val="22"/>
+              </w:rPr>
+            </w:pPr>
+            <w:r>
+              <w:rPr>
+                <w:rFonts w:ascii="Times New Roman" w:eastAsia="Yu Gothic" w:hAnsi="Times New Roman" w:cs="Times New Roman"/>
+                <w:color w:val="000000"/>
+                <w:sz w:val="22"/>
+                <w:szCs w:val="22"/>
+              </w:rPr>
+              <w:t>—</w:t>
+            </w:r>
+          </w:p>
+        </w:tc>
+        <w:tc>
+          <w:tcPr>
+            <w:tcW w:w="1738" w:type="dxa"/>
+            <w:vAlign w:val="center"/>
+          </w:tcPr>
+          <w:p>
+            <w:pPr>
+              <w:widowControl/>
+              <w:jc w:val="center"/>
+              <w:rPr>
+                <w:rFonts w:ascii="Times New Roman" w:hAnsi="Times New Roman" w:cs="Times New Roman"/>
+                <w:sz w:val="22"/>
+                <w:szCs w:val="22"/>
+              </w:rPr>
+            </w:pPr>
+            <w:r>
+              <w:rPr>
+                <w:rFonts w:ascii="Times New Roman" w:eastAsia="Yu Gothic" w:hAnsi="Times New Roman" w:cs="Times New Roman"/>
+                <w:color w:val="000000"/>
+                <w:sz w:val="22"/>
+                <w:szCs w:val="22"/>
+              </w:rPr>
+              <w:t>2 (0.0%)</w:t>
+            </w:r>
+          </w:p>
+        </w:tc>
+      </w:tr>
+      <w:tr>
+        <w:tc>
+          <w:tcPr>
+            <w:tcW w:w="1844" w:type="dxa"/>
+            <w:vAlign w:val="center"/>
+          </w:tcPr>
+          <w:p>
+            <w:pPr>
+              <w:widowControl/>
+              <w:jc w:val="left"/>
+              <w:rPr>
+                <w:rFonts w:ascii="Times New Roman" w:hAnsi="Times New Roman" w:cs="Times New Roman"/>
+                <w:sz w:val="22"/>
+                <w:szCs w:val="22"/>
+              </w:rPr>
+            </w:pPr>
+            <w:r>
+              <w:rPr>
+                <w:rFonts w:ascii="Times New Roman" w:eastAsia="Yu Gothic" w:hAnsi="Times New Roman" w:cs="Times New Roman"/>
+                <w:color w:val="000000"/>
+                <w:sz w:val="22"/>
+                <w:szCs w:val="22"/>
+              </w:rPr>
+              <w:t>Hemodynamic</w:t>
+            </w:r>
+          </w:p>
+        </w:tc>
+        <w:tc>
+          <w:tcPr>
+            <w:tcW w:w="2546" w:type="dxa"/>
+            <w:vAlign w:val="center"/>
+          </w:tcPr>
+          <w:p>
+            <w:pPr>
+              <w:widowControl/>
+              <w:jc w:val="left"/>
+              <w:rPr>
+                <w:rFonts w:ascii="Times New Roman" w:hAnsi="Times New Roman" w:cs="Times New Roman"/>
+                <w:sz w:val="22"/>
+                <w:szCs w:val="22"/>
+              </w:rPr>
+            </w:pPr>
+            <w:r>
+              <w:rPr>
+                <w:rFonts w:ascii="Times New Roman" w:eastAsia="Yu Gothic" w:hAnsi="Times New Roman" w:cs="Times New Roman"/>
+                <w:color w:val="000000"/>
+                <w:sz w:val="22"/>
+                <w:szCs w:val="22"/>
+              </w:rPr>
+              <w:t>NIBP</w:t>
+            </w:r>
+          </w:p>
+        </w:tc>
+        <w:tc>
+          <w:tcPr>
+            <w:tcW w:w="1737" w:type="dxa"/>
+            <w:vAlign w:val="center"/>
+          </w:tcPr>
+          <w:p>
+            <w:pPr>
+              <w:widowControl/>
+              <w:jc w:val="center"/>
+              <w:rPr>
+                <w:rFonts w:ascii="Times New Roman" w:hAnsi="Times New Roman" w:cs="Times New Roman"/>
+                <w:sz w:val="22"/>
+                <w:szCs w:val="22"/>
+              </w:rPr>
+            </w:pPr>
+            <w:r>
+              <w:rPr>
+                <w:rFonts w:ascii="Times New Roman" w:eastAsia="Yu Gothic" w:hAnsi="Times New Roman" w:cs="Times New Roman"/>
+                <w:color w:val="000000"/>
+                <w:sz w:val="22"/>
+                <w:szCs w:val="22"/>
+              </w:rPr>
+              <w:t>46 (2.8%)</w:t>
+            </w:r>
+          </w:p>
+        </w:tc>
+        <w:tc>
+          <w:tcPr>
+            <w:tcW w:w="1738" w:type="dxa"/>
+            <w:vAlign w:val="center"/>
+          </w:tcPr>
+          <w:p>
+            <w:pPr>
+              <w:widowControl/>
+              <w:jc w:val="center"/>
+              <w:rPr>
+                <w:rFonts w:ascii="Times New Roman" w:hAnsi="Times New Roman" w:cs="Times New Roman"/>
+                <w:sz w:val="22"/>
+                <w:szCs w:val="22"/>
+              </w:rPr>
+            </w:pPr>
+            <w:r>
+              <w:rPr>
+                <w:rFonts w:ascii="Times New Roman" w:eastAsia="Yu Gothic" w:hAnsi="Times New Roman" w:cs="Times New Roman"/>
+                <w:color w:val="000000"/>
+                <w:sz w:val="22"/>
+                <w:szCs w:val="22"/>
+              </w:rPr>
+              <w:t>5 (0.0%)</w:t>
+            </w:r>
+          </w:p>
+        </w:tc>
+        <w:tc>
+          <w:tcPr>
+            <w:tcW w:w="1738" w:type="dxa"/>
+            <w:vAlign w:val="center"/>
+          </w:tcPr>
+          <w:p>
+            <w:pPr>
+              <w:widowControl/>
+              <w:jc w:val="center"/>
+              <w:rPr>
+                <w:rFonts w:ascii="Times New Roman" w:hAnsi="Times New Roman" w:cs="Times New Roman"/>
+                <w:sz w:val="22"/>
+                <w:szCs w:val="22"/>
+              </w:rPr>
+            </w:pPr>
+            <w:r>
+              <w:rPr>
+                <w:rFonts w:ascii="Times New Roman" w:eastAsia="Yu Gothic" w:hAnsi="Times New Roman" w:cs="Times New Roman"/>
+                <w:color w:val="000000"/>
+                <w:sz w:val="22"/>
+                <w:szCs w:val="22"/>
+              </w:rPr>
+              <w:t>—</w:t>
+            </w:r>
+          </w:p>
+        </w:tc>
+        <w:tc>
+          <w:tcPr>
+            <w:tcW w:w="1738" w:type="dxa"/>
+            <w:vAlign w:val="center"/>
+          </w:tcPr>
+          <w:p>
+            <w:pPr>
+              <w:widowControl/>
+              <w:jc w:val="center"/>
+              <w:rPr>
+                <w:rFonts w:ascii="Times New Roman" w:hAnsi="Times New Roman" w:cs="Times New Roman"/>
+                <w:sz w:val="22"/>
+                <w:szCs w:val="22"/>
+              </w:rPr>
+            </w:pPr>
+            <w:r>
+              <w:rPr>
+                <w:rFonts w:ascii="Times New Roman" w:eastAsia="Yu Gothic" w:hAnsi="Times New Roman" w:cs="Times New Roman"/>
+                <w:color w:val="000000"/>
+                <w:sz w:val="22"/>
+                <w:szCs w:val="22"/>
+              </w:rPr>
+              <w:t>51 (0.1%)</w:t>
+            </w:r>
+          </w:p>
+        </w:tc>
+      </w:tr>
+      <w:tr>
+        <w:tc>
+          <w:tcPr>
+            <w:tcW w:w="1844" w:type="dxa"/>
+            <w:vAlign w:val="center"/>
+          </w:tcPr>
+          <w:p>
+            <w:pPr>
+              <w:widowControl/>
+              <w:jc w:val="left"/>
+              <w:rPr>
+                <w:rFonts w:ascii="Times New Roman" w:hAnsi="Times New Roman" w:cs="Times New Roman"/>
+                <w:sz w:val="22"/>
+                <w:szCs w:val="22"/>
+              </w:rPr>
+            </w:pPr>
+            <w:r>
+              <w:rPr>
+                <w:rFonts w:ascii="Times New Roman" w:eastAsia="Yu Gothic" w:hAnsi="Times New Roman" w:cs="Times New Roman"/>
+                <w:color w:val="000000"/>
+                <w:sz w:val="22"/>
+                <w:szCs w:val="22"/>
+              </w:rPr>
+              <w:t>Hemodynamic</w:t>
+            </w:r>
+          </w:p>
+        </w:tc>
+        <w:tc>
+          <w:tcPr>
+            <w:tcW w:w="2546" w:type="dxa"/>
+            <w:vAlign w:val="center"/>
+          </w:tcPr>
+          <w:p>
+            <w:pPr>
+              <w:widowControl/>
+              <w:jc w:val="left"/>
+              <w:rPr>
+                <w:rFonts w:ascii="Times New Roman" w:hAnsi="Times New Roman" w:cs="Times New Roman"/>
+                <w:sz w:val="22"/>
+                <w:szCs w:val="22"/>
+              </w:rPr>
+            </w:pPr>
+            <w:r>
+              <w:rPr>
+                <w:rFonts w:ascii="Times New Roman" w:eastAsia="Yu Gothic" w:hAnsi="Times New Roman" w:cs="Times New Roman"/>
+                <w:color w:val="000000"/>
+                <w:sz w:val="22"/>
+                <w:szCs w:val="22"/>
+              </w:rPr>
+              <w:t>NIBP (systolic)</w:t>
+            </w:r>
+          </w:p>
+        </w:tc>
+        <w:tc>
+          <w:tcPr>
+            <w:tcW w:w="1737" w:type="dxa"/>
+            <w:vAlign w:val="center"/>
+          </w:tcPr>
+          <w:p>
+            <w:pPr>
+              <w:widowControl/>
+              <w:jc w:val="center"/>
+              <w:rPr>
+                <w:rFonts w:ascii="Times New Roman" w:hAnsi="Times New Roman" w:cs="Times New Roman"/>
+                <w:sz w:val="22"/>
+                <w:szCs w:val="22"/>
+              </w:rPr>
+            </w:pPr>
+            <w:r>
+              <w:rPr>
+                <w:rFonts w:ascii="Times New Roman" w:eastAsia="Yu Gothic" w:hAnsi="Times New Roman" w:cs="Times New Roman"/>
+                <w:color w:val="000000"/>
+                <w:sz w:val="22"/>
+                <w:szCs w:val="22"/>
+              </w:rPr>
+              <w:t>—</w:t>
+            </w:r>
+          </w:p>
+        </w:tc>
+        <w:tc>
+          <w:tcPr>
+            <w:tcW w:w="1738" w:type="dxa"/>
+            <w:vAlign w:val="center"/>
+          </w:tcPr>
+          <w:p>
+            <w:pPr>
+              <w:widowControl/>
+              <w:jc w:val="center"/>
+              <w:rPr>
+                <w:rFonts w:ascii="Times New Roman" w:hAnsi="Times New Roman" w:cs="Times New Roman"/>
+                <w:sz w:val="22"/>
+                <w:szCs w:val="22"/>
+              </w:rPr>
+            </w:pPr>
+            <w:r>
+              <w:rPr>
+                <w:rFonts w:ascii="Times New Roman" w:eastAsia="Yu Gothic" w:hAnsi="Times New Roman" w:cs="Times New Roman"/>
+                <w:color w:val="000000"/>
+                <w:sz w:val="22"/>
+                <w:szCs w:val="22"/>
+              </w:rPr>
+              <w:t>426 (0.7%)</w:t>
+            </w:r>
+          </w:p>
+        </w:tc>
+        <w:tc>
+          <w:tcPr>
+            <w:tcW w:w="1738" w:type="dxa"/>
+            <w:vAlign w:val="center"/>
+          </w:tcPr>
+          <w:p>
+            <w:pPr>
+              <w:widowControl/>
+              <w:jc w:val="center"/>
+              <w:rPr>
+                <w:rFonts w:ascii="Times New Roman" w:hAnsi="Times New Roman" w:cs="Times New Roman"/>
+                <w:sz w:val="22"/>
+                <w:szCs w:val="22"/>
+              </w:rPr>
+            </w:pPr>
+            <w:r>
+              <w:rPr>
+                <w:rFonts w:ascii="Times New Roman" w:eastAsia="Yu Gothic" w:hAnsi="Times New Roman" w:cs="Times New Roman"/>
+                <w:color w:val="000000"/>
+                <w:sz w:val="22"/>
+                <w:szCs w:val="22"/>
+              </w:rPr>
+              <w:t>—</w:t>
+            </w:r>
+          </w:p>
+        </w:tc>
+        <w:tc>
+          <w:tcPr>
+            <w:tcW w:w="1738" w:type="dxa"/>
+            <w:vAlign w:val="center"/>
+          </w:tcPr>
+          <w:p>
+            <w:pPr>
+              <w:widowControl/>
+              <w:jc w:val="center"/>
+              <w:rPr>
+                <w:rFonts w:ascii="Times New Roman" w:hAnsi="Times New Roman" w:cs="Times New Roman"/>
+                <w:sz w:val="22"/>
+                <w:szCs w:val="22"/>
+              </w:rPr>
+            </w:pPr>
+            <w:r>
+              <w:rPr>
+                <w:rFonts w:ascii="Times New Roman" w:eastAsia="Yu Gothic" w:hAnsi="Times New Roman" w:cs="Times New Roman"/>
+                <w:color w:val="000000"/>
+                <w:sz w:val="22"/>
+                <w:szCs w:val="22"/>
+              </w:rPr>
+              <w:t>426 (0.7%)</w:t>
+            </w:r>
+          </w:p>
+        </w:tc>
+      </w:tr>
+      <w:tr>
+        <w:tc>
+          <w:tcPr>
+            <w:tcW w:w="1844" w:type="dxa"/>
+            <w:vAlign w:val="center"/>
+          </w:tcPr>
+          <w:p>
+            <w:pPr>
+              <w:widowControl/>
+              <w:jc w:val="left"/>
+              <w:rPr>
+                <w:rFonts w:ascii="Times New Roman" w:hAnsi="Times New Roman" w:cs="Times New Roman"/>
+                <w:sz w:val="22"/>
+                <w:szCs w:val="22"/>
+              </w:rPr>
+            </w:pPr>
+            <w:r>
+              <w:rPr>
+                <w:rFonts w:ascii="Times New Roman" w:eastAsia="Yu Gothic" w:hAnsi="Times New Roman" w:cs="Times New Roman"/>
+                <w:color w:val="000000"/>
+                <w:sz w:val="22"/>
+                <w:szCs w:val="22"/>
+              </w:rPr>
+              <w:t>Hemodynamic</w:t>
+            </w:r>
+          </w:p>
+        </w:tc>
+        <w:tc>
+          <w:tcPr>
+            <w:tcW w:w="2546" w:type="dxa"/>
+            <w:vAlign w:val="center"/>
+          </w:tcPr>
+          <w:p>
+            <w:pPr>
+              <w:widowControl/>
+              <w:jc w:val="left"/>
+              <w:rPr>
+                <w:rFonts w:ascii="Times New Roman" w:hAnsi="Times New Roman" w:cs="Times New Roman"/>
+                <w:sz w:val="22"/>
+                <w:szCs w:val="22"/>
+              </w:rPr>
+            </w:pPr>
+            <w:r>
+              <w:rPr>
+                <w:rFonts w:ascii="Times New Roman" w:eastAsia="Yu Gothic" w:hAnsi="Times New Roman" w:cs="Times New Roman"/>
+                <w:color w:val="000000"/>
+                <w:sz w:val="22"/>
+                <w:szCs w:val="22"/>
+              </w:rPr>
+              <w:t>Arterial pressure</w:t>
+            </w:r>
+          </w:p>
+        </w:tc>
+        <w:tc>
+          <w:tcPr>
+            <w:tcW w:w="1737" w:type="dxa"/>
+            <w:vAlign w:val="center"/>
+          </w:tcPr>
+          <w:p>
+            <w:pPr>
+              <w:widowControl/>
+              <w:jc w:val="center"/>
+              <w:rPr>
+                <w:rFonts w:ascii="Times New Roman" w:hAnsi="Times New Roman" w:cs="Times New Roman"/>
+                <w:sz w:val="22"/>
+                <w:szCs w:val="22"/>
+              </w:rPr>
+            </w:pPr>
+            <w:r>
+              <w:rPr>
+                <w:rFonts w:ascii="Times New Roman" w:eastAsia="Yu Gothic" w:hAnsi="Times New Roman" w:cs="Times New Roman"/>
+                <w:color w:val="000000"/>
+                <w:sz w:val="22"/>
+                <w:szCs w:val="22"/>
+              </w:rPr>
+              <w:t>1 (0.1%)</w:t>
+            </w:r>
+          </w:p>
+        </w:tc>
+        <w:tc>
+          <w:tcPr>
+            <w:tcW w:w="1738" w:type="dxa"/>
+            <w:vAlign w:val="center"/>
+          </w:tcPr>
+          <w:p>
+            <w:pPr>
+              <w:widowControl/>
+              <w:jc w:val="center"/>
+              <w:rPr>
+                <w:rFonts w:ascii="Times New Roman" w:hAnsi="Times New Roman" w:cs="Times New Roman"/>
+                <w:sz w:val="22"/>
+                <w:szCs w:val="22"/>
+              </w:rPr>
+            </w:pPr>
+            <w:r>
+              <w:rPr>
+                <w:rFonts w:ascii="Times New Roman" w:eastAsia="Yu Gothic" w:hAnsi="Times New Roman" w:cs="Times New Roman"/>
+                <w:color w:val="000000"/>
+                <w:sz w:val="22"/>
+                <w:szCs w:val="22"/>
+              </w:rPr>
+              <w:t>—</w:t>
+            </w:r>
+          </w:p>
+        </w:tc>
+        <w:tc>
+          <w:tcPr>
+            <w:tcW w:w="1738" w:type="dxa"/>
+            <w:vAlign w:val="center"/>
+          </w:tcPr>
+          <w:p>
+            <w:pPr>
+              <w:widowControl/>
+              <w:jc w:val="center"/>
+              <w:rPr>
+                <w:rFonts w:ascii="Times New Roman" w:hAnsi="Times New Roman" w:cs="Times New Roman"/>
+                <w:sz w:val="22"/>
+                <w:szCs w:val="22"/>
+              </w:rPr>
+            </w:pPr>
+            <w:r>
+              <w:rPr>
+                <w:rFonts w:ascii="Times New Roman" w:eastAsia="Yu Gothic" w:hAnsi="Times New Roman" w:cs="Times New Roman"/>
+                <w:color w:val="000000"/>
+                <w:sz w:val="22"/>
+                <w:szCs w:val="22"/>
+              </w:rPr>
+              <w:t>—</w:t>
+            </w:r>
+          </w:p>
+        </w:tc>
+        <w:tc>
+          <w:tcPr>
+            <w:tcW w:w="1738" w:type="dxa"/>
+            <w:vAlign w:val="center"/>
+          </w:tcPr>
+          <w:p>
+            <w:pPr>
+              <w:widowControl/>
+              <w:jc w:val="center"/>
+              <w:rPr>
+                <w:rFonts w:ascii="Times New Roman" w:hAnsi="Times New Roman" w:cs="Times New Roman"/>
+                <w:sz w:val="22"/>
+                <w:szCs w:val="22"/>
+              </w:rPr>
+            </w:pPr>
+            <w:r>
+              <w:rPr>
+                <w:rFonts w:ascii="Times New Roman" w:eastAsia="Yu Gothic" w:hAnsi="Times New Roman" w:cs="Times New Roman"/>
+                <w:color w:val="000000"/>
+                <w:sz w:val="22"/>
+                <w:szCs w:val="22"/>
+              </w:rPr>
+              <w:t>1 (0.0%)</w:t>
+            </w:r>
+          </w:p>
+        </w:tc>
+      </w:tr>
+      <w:tr>
+        <w:tc>
+          <w:tcPr>
+            <w:tcW w:w="1844" w:type="dxa"/>
+            <w:vAlign w:val="center"/>
+          </w:tcPr>
+          <w:p>
+            <w:pPr>
+              <w:widowControl/>
+              <w:jc w:val="left"/>
+              <w:rPr>
+                <w:rFonts w:ascii="Times New Roman" w:hAnsi="Times New Roman" w:cs="Times New Roman"/>
+                <w:sz w:val="22"/>
+                <w:szCs w:val="22"/>
+              </w:rPr>
+            </w:pPr>
+            <w:r>
+              <w:rPr>
+                <w:rFonts w:ascii="Times New Roman" w:eastAsia="Yu Gothic" w:hAnsi="Times New Roman" w:cs="Times New Roman"/>
+                <w:color w:val="000000"/>
+                <w:sz w:val="22"/>
+                <w:szCs w:val="22"/>
+              </w:rPr>
+              <w:t>Temperature</w:t>
+            </w:r>
+          </w:p>
+        </w:tc>
+        <w:tc>
+          <w:tcPr>
+            <w:tcW w:w="2546" w:type="dxa"/>
+            <w:vAlign w:val="center"/>
+          </w:tcPr>
+          <w:p>
+            <w:pPr>
+              <w:widowControl/>
+              <w:jc w:val="left"/>
+              <w:rPr>
+                <w:rFonts w:ascii="Times New Roman" w:hAnsi="Times New Roman" w:cs="Times New Roman"/>
+                <w:sz w:val="22"/>
+                <w:szCs w:val="22"/>
+              </w:rPr>
+            </w:pPr>
+            <w:r>
+              <w:rPr>
+                <w:rFonts w:ascii="Times New Roman" w:eastAsia="Yu Gothic" w:hAnsi="Times New Roman" w:cs="Times New Roman"/>
+                <w:color w:val="000000"/>
+                <w:sz w:val="22"/>
+                <w:szCs w:val="22"/>
+              </w:rPr>
+              <w:t>Temperature (T1)</w:t>
+            </w:r>
+          </w:p>
+        </w:tc>
+        <w:tc>
+          <w:tcPr>
+            <w:tcW w:w="1737" w:type="dxa"/>
+            <w:vAlign w:val="center"/>
+          </w:tcPr>
+          <w:p>
+            <w:pPr>
+              <w:widowControl/>
+              <w:jc w:val="center"/>
+              <w:rPr>
+                <w:rFonts w:ascii="Times New Roman" w:hAnsi="Times New Roman" w:cs="Times New Roman"/>
+                <w:sz w:val="22"/>
+                <w:szCs w:val="22"/>
+              </w:rPr>
+            </w:pPr>
+            <w:r>
+              <w:rPr>
+                <w:rFonts w:ascii="Times New Roman" w:eastAsia="Yu Gothic" w:hAnsi="Times New Roman" w:cs="Times New Roman"/>
+                <w:color w:val="000000"/>
+                <w:sz w:val="22"/>
+                <w:szCs w:val="22"/>
+              </w:rPr>
+              <w:t>2 (0.1%)</w:t>
+            </w:r>
+          </w:p>
+        </w:tc>
+        <w:tc>
+          <w:tcPr>
+            <w:tcW w:w="1738" w:type="dxa"/>
+            <w:vAlign w:val="center"/>
+          </w:tcPr>
+          <w:p>
+            <w:pPr>
+              <w:widowControl/>
+              <w:jc w:val="center"/>
+              <w:rPr>
+                <w:rFonts w:ascii="Times New Roman" w:hAnsi="Times New Roman" w:cs="Times New Roman"/>
+                <w:sz w:val="22"/>
+                <w:szCs w:val="22"/>
+              </w:rPr>
+            </w:pPr>
+            <w:r>
+              <w:rPr>
+                <w:rFonts w:ascii="Times New Roman" w:eastAsia="Yu Gothic" w:hAnsi="Times New Roman" w:cs="Times New Roman"/>
+                <w:color w:val="000000"/>
+                <w:sz w:val="22"/>
+                <w:szCs w:val="22"/>
+              </w:rPr>
+              <w:t>—</w:t>
+            </w:r>
+          </w:p>
+        </w:tc>
+        <w:tc>
+          <w:tcPr>
+            <w:tcW w:w="1738" w:type="dxa"/>
+            <w:vAlign w:val="center"/>
+          </w:tcPr>
+          <w:p>
+            <w:pPr>
+              <w:widowControl/>
+              <w:jc w:val="center"/>
+              <w:rPr>
+                <w:rFonts w:ascii="Times New Roman" w:hAnsi="Times New Roman" w:cs="Times New Roman"/>
+                <w:sz w:val="22"/>
+                <w:szCs w:val="22"/>
+              </w:rPr>
+            </w:pPr>
+            <w:r>
+              <w:rPr>
+                <w:rFonts w:ascii="Times New Roman" w:eastAsia="Yu Gothic" w:hAnsi="Times New Roman" w:cs="Times New Roman"/>
+                <w:color w:val="000000"/>
+                <w:sz w:val="22"/>
+                <w:szCs w:val="22"/>
+              </w:rPr>
+              <w:t>—</w:t>
+            </w:r>
+          </w:p>
+        </w:tc>
+        <w:tc>
+          <w:tcPr>
+            <w:tcW w:w="1738" w:type="dxa"/>
+            <w:vAlign w:val="center"/>
+          </w:tcPr>
+          <w:p>
+            <w:pPr>
+              <w:widowControl/>
+              <w:jc w:val="center"/>
+              <w:rPr>
+                <w:rFonts w:ascii="Times New Roman" w:hAnsi="Times New Roman" w:cs="Times New Roman"/>
+                <w:sz w:val="22"/>
+                <w:szCs w:val="22"/>
+              </w:rPr>
+            </w:pPr>
+            <w:r>
+              <w:rPr>
+                <w:rFonts w:ascii="Times New Roman" w:eastAsia="Yu Gothic" w:hAnsi="Times New Roman" w:cs="Times New Roman"/>
+                <w:color w:val="000000"/>
+                <w:sz w:val="22"/>
+                <w:szCs w:val="22"/>
+              </w:rPr>
+              <w:t>2 (0.0%)</w:t>
+            </w:r>
+          </w:p>
+        </w:tc>
+      </w:tr>
+      <w:tr>
+        <w:tc>
+          <w:tcPr>
+            <w:tcW w:w="1844" w:type="dxa"/>
+            <w:vAlign w:val="center"/>
+          </w:tcPr>
+          <w:p>
+            <w:pPr>
+              <w:widowControl/>
+              <w:jc w:val="left"/>
+              <w:rPr>
+                <w:rFonts w:ascii="Times New Roman" w:hAnsi="Times New Roman" w:cs="Times New Roman"/>
+                <w:sz w:val="22"/>
+                <w:szCs w:val="22"/>
+              </w:rPr>
+            </w:pPr>
+            <w:r>
+              <w:rPr>
+                <w:rFonts w:ascii="Times New Roman" w:eastAsia="Yu Gothic" w:hAnsi="Times New Roman" w:cs="Times New Roman"/>
+                <w:color w:val="000000"/>
+                <w:sz w:val="22"/>
+                <w:szCs w:val="22"/>
+              </w:rPr>
+              <w:t>Temperature</w:t>
+            </w:r>
+          </w:p>
+        </w:tc>
+        <w:tc>
+          <w:tcPr>
+            <w:tcW w:w="2546" w:type="dxa"/>
+            <w:vAlign w:val="center"/>
+          </w:tcPr>
+          <w:p>
+            <w:pPr>
+              <w:widowControl/>
+              <w:jc w:val="left"/>
+              <w:rPr>
+                <w:rFonts w:ascii="Times New Roman" w:hAnsi="Times New Roman" w:cs="Times New Roman"/>
+                <w:sz w:val="22"/>
+                <w:szCs w:val="22"/>
+              </w:rPr>
+            </w:pPr>
+            <w:r>
+              <w:rPr>
+                <w:rFonts w:ascii="Times New Roman" w:eastAsia="Yu Gothic" w:hAnsi="Times New Roman" w:cs="Times New Roman"/>
+                <w:color w:val="000000"/>
+                <w:sz w:val="22"/>
+                <w:szCs w:val="22"/>
+              </w:rPr>
+              <w:t>Temperature (T2)</w:t>
+            </w:r>
+          </w:p>
+        </w:tc>
+        <w:tc>
+          <w:tcPr>
+            <w:tcW w:w="1737" w:type="dxa"/>
+            <w:vAlign w:val="center"/>
+          </w:tcPr>
+          <w:p>
+            <w:pPr>
+              <w:widowControl/>
+              <w:jc w:val="center"/>
+              <w:rPr>
+                <w:rFonts w:ascii="Times New Roman" w:hAnsi="Times New Roman" w:cs="Times New Roman"/>
+                <w:sz w:val="22"/>
+                <w:szCs w:val="22"/>
+              </w:rPr>
+            </w:pPr>
+            <w:r>
+              <w:rPr>
+                <w:rFonts w:ascii="Times New Roman" w:eastAsia="Yu Gothic" w:hAnsi="Times New Roman" w:cs="Times New Roman"/>
+                <w:color w:val="000000"/>
+                <w:sz w:val="22"/>
+                <w:szCs w:val="22"/>
+              </w:rPr>
+              <w:t>1 (0.1%)</w:t>
+            </w:r>
+          </w:p>
+        </w:tc>
+        <w:tc>
+          <w:tcPr>
+            <w:tcW w:w="1738" w:type="dxa"/>
+            <w:vAlign w:val="center"/>
+          </w:tcPr>
+          <w:p>
+            <w:pPr>
+              <w:widowControl/>
+              <w:jc w:val="center"/>
+              <w:rPr>
+                <w:rFonts w:ascii="Times New Roman" w:hAnsi="Times New Roman" w:cs="Times New Roman"/>
+                <w:sz w:val="22"/>
+                <w:szCs w:val="22"/>
+              </w:rPr>
+            </w:pPr>
+            <w:r>
+              <w:rPr>
+                <w:rFonts w:ascii="Times New Roman" w:eastAsia="Yu Gothic" w:hAnsi="Times New Roman" w:cs="Times New Roman"/>
+                <w:color w:val="000000"/>
+                <w:sz w:val="22"/>
+                <w:szCs w:val="22"/>
+              </w:rPr>
+              <w:t>—</w:t>
+            </w:r>
+          </w:p>
+        </w:tc>
+        <w:tc>
+          <w:tcPr>
+            <w:tcW w:w="1738" w:type="dxa"/>
+            <w:vAlign w:val="center"/>
+          </w:tcPr>
+          <w:p>
+            <w:pPr>
+              <w:widowControl/>
+              <w:jc w:val="center"/>
+              <w:rPr>
+                <w:rFonts w:ascii="Times New Roman" w:hAnsi="Times New Roman" w:cs="Times New Roman"/>
+                <w:sz w:val="22"/>
+                <w:szCs w:val="22"/>
+              </w:rPr>
+            </w:pPr>
+            <w:r>
+              <w:rPr>
+                <w:rFonts w:ascii="Times New Roman" w:eastAsia="Yu Gothic" w:hAnsi="Times New Roman" w:cs="Times New Roman"/>
+                <w:color w:val="000000"/>
+                <w:sz w:val="22"/>
+                <w:szCs w:val="22"/>
+              </w:rPr>
+              <w:t>—</w:t>
+            </w:r>
+          </w:p>
+        </w:tc>
+        <w:tc>
+          <w:tcPr>
+            <w:tcW w:w="1738" w:type="dxa"/>
+            <w:vAlign w:val="center"/>
+          </w:tcPr>
+          <w:p>
+            <w:pPr>
+              <w:widowControl/>
+              <w:jc w:val="center"/>
+              <w:rPr>
+                <w:rFonts w:ascii="Times New Roman" w:hAnsi="Times New Roman" w:cs="Times New Roman"/>
+                <w:sz w:val="22"/>
+                <w:szCs w:val="22"/>
+              </w:rPr>
+            </w:pPr>
+            <w:r>
+              <w:rPr>
+                <w:rFonts w:ascii="Times New Roman" w:eastAsia="Yu Gothic" w:hAnsi="Times New Roman" w:cs="Times New Roman"/>
+                <w:color w:val="000000"/>
+                <w:sz w:val="22"/>
+                <w:szCs w:val="22"/>
+              </w:rPr>
+              <w:t>1 (0.0%)</w:t>
+            </w:r>
+          </w:p>
+        </w:tc>
+      </w:tr>
+      <w:tr>
+        <w:tc>
+          <w:tcPr>
+            <w:tcW w:w="1844" w:type="dxa"/>
+            <w:vAlign w:val="center"/>
+          </w:tcPr>
+          <w:p>
+            <w:pPr>
+              <w:widowControl/>
+              <w:jc w:val="left"/>
+              <w:rPr>
+                <w:rFonts w:ascii="Times New Roman" w:hAnsi="Times New Roman" w:cs="Times New Roman"/>
+                <w:sz w:val="22"/>
+                <w:szCs w:val="22"/>
+              </w:rPr>
+            </w:pPr>
+            <w:r>
+              <w:rPr>
+                <w:rFonts w:ascii="Times New Roman" w:eastAsia="Yu Gothic" w:hAnsi="Times New Roman" w:cs="Times New Roman"/>
+                <w:color w:val="000000"/>
+                <w:sz w:val="22"/>
+                <w:szCs w:val="22"/>
+              </w:rPr>
+              <w:t>Temperature</w:t>
+            </w:r>
+          </w:p>
+        </w:tc>
+        <w:tc>
+          <w:tcPr>
+            <w:tcW w:w="2546" w:type="dxa"/>
+            <w:vAlign w:val="center"/>
+          </w:tcPr>
+          <w:p>
+            <w:pPr>
+              <w:widowControl/>
+              <w:jc w:val="left"/>
+              <w:rPr>
+                <w:rFonts w:ascii="Times New Roman" w:hAnsi="Times New Roman" w:cs="Times New Roman"/>
+                <w:sz w:val="22"/>
+                <w:szCs w:val="22"/>
+              </w:rPr>
+            </w:pPr>
+            <w:r>
+              <w:rPr>
+                <w:rFonts w:ascii="Times New Roman" w:eastAsia="Yu Gothic" w:hAnsi="Times New Roman" w:cs="Times New Roman"/>
+                <w:color w:val="000000"/>
+                <w:sz w:val="22"/>
+                <w:szCs w:val="22"/>
+              </w:rPr>
+              <w:t>Body temperature (Tb)</w:t>
+            </w:r>
+          </w:p>
+        </w:tc>
+        <w:tc>
+          <w:tcPr>
+            <w:tcW w:w="1737" w:type="dxa"/>
+            <w:vAlign w:val="center"/>
+          </w:tcPr>
+          <w:p>
+            <w:pPr>
+              <w:widowControl/>
+              <w:jc w:val="center"/>
+              <w:rPr>
+                <w:rFonts w:ascii="Times New Roman" w:hAnsi="Times New Roman" w:cs="Times New Roman"/>
+                <w:sz w:val="22"/>
+                <w:szCs w:val="22"/>
+              </w:rPr>
+            </w:pPr>
+            <w:r>
+              <w:rPr>
+                <w:rFonts w:ascii="Times New Roman" w:eastAsia="Yu Gothic" w:hAnsi="Times New Roman" w:cs="Times New Roman"/>
+                <w:color w:val="000000"/>
+                <w:sz w:val="22"/>
+                <w:szCs w:val="22"/>
+              </w:rPr>
+              <w:t>1 (0.1%)</w:t>
+            </w:r>
+          </w:p>
+        </w:tc>
+        <w:tc>
+          <w:tcPr>
+            <w:tcW w:w="1738" w:type="dxa"/>
+            <w:vAlign w:val="center"/>
+          </w:tcPr>
+          <w:p>
+            <w:pPr>
+              <w:widowControl/>
+              <w:jc w:val="center"/>
+              <w:rPr>
+                <w:rFonts w:ascii="Times New Roman" w:hAnsi="Times New Roman" w:cs="Times New Roman"/>
+                <w:sz w:val="22"/>
+                <w:szCs w:val="22"/>
+              </w:rPr>
+            </w:pPr>
+            <w:r>
+              <w:rPr>
+                <w:rFonts w:ascii="Times New Roman" w:eastAsia="Yu Gothic" w:hAnsi="Times New Roman" w:cs="Times New Roman"/>
+                <w:color w:val="000000"/>
+                <w:sz w:val="22"/>
+                <w:szCs w:val="22"/>
+              </w:rPr>
+              <w:t>—</w:t>
+            </w:r>
+          </w:p>
+        </w:tc>
+        <w:tc>
+          <w:tcPr>
+            <w:tcW w:w="1738" w:type="dxa"/>
+            <w:vAlign w:val="center"/>
+          </w:tcPr>
+          <w:p>
+            <w:pPr>
+              <w:widowControl/>
+              <w:jc w:val="center"/>
+              <w:rPr>
+                <w:rFonts w:ascii="Times New Roman" w:hAnsi="Times New Roman" w:cs="Times New Roman"/>
+                <w:sz w:val="22"/>
+                <w:szCs w:val="22"/>
+              </w:rPr>
+            </w:pPr>
+            <w:r>
+              <w:rPr>
+                <w:rFonts w:ascii="Times New Roman" w:eastAsia="Yu Gothic" w:hAnsi="Times New Roman" w:cs="Times New Roman"/>
+                <w:color w:val="000000"/>
+                <w:sz w:val="22"/>
+                <w:szCs w:val="22"/>
+              </w:rPr>
+              <w:t>—</w:t>
+            </w:r>
+          </w:p>
+        </w:tc>
+        <w:tc>
+          <w:tcPr>
+            <w:tcW w:w="1738" w:type="dxa"/>
+            <w:vAlign w:val="center"/>
+          </w:tcPr>
+          <w:p>
+            <w:pPr>
+              <w:widowControl/>
+              <w:jc w:val="center"/>
+              <w:rPr>
+                <w:rFonts w:ascii="Times New Roman" w:hAnsi="Times New Roman" w:cs="Times New Roman"/>
+                <w:sz w:val="22"/>
+                <w:szCs w:val="22"/>
+              </w:rPr>
+            </w:pPr>
+            <w:r>
+              <w:rPr>
+                <w:rFonts w:ascii="Times New Roman" w:eastAsia="Yu Gothic" w:hAnsi="Times New Roman" w:cs="Times New Roman"/>
+                <w:color w:val="000000"/>
+                <w:sz w:val="22"/>
+                <w:szCs w:val="22"/>
+              </w:rPr>
+              <w:t>1 (0.0%)</w:t>
+            </w:r>
+          </w:p>
+        </w:tc>
+      </w:tr>
+      <w:tr>
+        <w:tc>
+          <w:tcPr>
+            <w:tcW w:w="1844" w:type="dxa"/>
+            <w:vAlign w:val="center"/>
+          </w:tcPr>
+          <w:p>
+            <w:pPr>
+              <w:widowControl/>
+              <w:jc w:val="left"/>
+              <w:rPr>
+                <w:rFonts w:ascii="Times New Roman" w:hAnsi="Times New Roman" w:cs="Times New Roman"/>
+                <w:sz w:val="22"/>
+                <w:szCs w:val="22"/>
+              </w:rPr>
+            </w:pPr>
+          </w:p>
+        </w:tc>
+        <w:tc>
+          <w:tcPr>
+            <w:tcW w:w="2546" w:type="dxa"/>
+            <w:vAlign w:val="center"/>
+          </w:tcPr>
+          <w:p>
+            <w:pPr>
+              <w:widowControl/>
+              <w:jc w:val="left"/>
+              <w:rPr>
+                <w:rFonts w:ascii="Times New Roman" w:hAnsi="Times New Roman" w:cs="Times New Roman"/>
+                <w:sz w:val="22"/>
+                <w:szCs w:val="22"/>
+              </w:rPr>
+            </w:pPr>
+            <w:r>
+              <w:rPr>
+                <w:rFonts w:ascii="Times New Roman" w:eastAsia="Yu Gothic" w:hAnsi="Times New Roman" w:cs="Times New Roman"/>
+                <w:color w:val="000000"/>
+                <w:sz w:val="22"/>
+                <w:szCs w:val="22"/>
+              </w:rPr>
+              <w:t>Total</w:t>
+            </w:r>
+          </w:p>
+        </w:tc>
+        <w:tc>
+          <w:tcPr>
+            <w:tcW w:w="1737" w:type="dxa"/>
+            <w:vAlign w:val="center"/>
+          </w:tcPr>
+          <w:p>
+            <w:pPr>
+              <w:widowControl/>
+              <w:jc w:val="center"/>
+              <w:rPr>
+                <w:rFonts w:ascii="Times New Roman" w:hAnsi="Times New Roman" w:cs="Times New Roman"/>
+                <w:sz w:val="22"/>
+                <w:szCs w:val="22"/>
+              </w:rPr>
+            </w:pPr>
+            <w:r>
+              <w:rPr>
+                <w:rFonts w:ascii="Times New Roman" w:eastAsia="Yu Gothic" w:hAnsi="Times New Roman" w:cs="Times New Roman"/>
+                <w:color w:val="000000"/>
+                <w:sz w:val="22"/>
+                <w:szCs w:val="22"/>
+              </w:rPr>
+              <w:t>1649 (100.0%)</w:t>
+            </w:r>
+          </w:p>
+        </w:tc>
+        <w:tc>
+          <w:tcPr>
+            <w:tcW w:w="1738" w:type="dxa"/>
+            <w:vAlign w:val="center"/>
+          </w:tcPr>
+          <w:p>
+            <w:pPr>
+              <w:widowControl/>
+              <w:jc w:val="center"/>
+              <w:rPr>
+                <w:rFonts w:ascii="Times New Roman" w:hAnsi="Times New Roman" w:cs="Times New Roman"/>
+                <w:sz w:val="22"/>
+                <w:szCs w:val="22"/>
+              </w:rPr>
+            </w:pPr>
+            <w:r>
+              <w:rPr>
+                <w:rFonts w:ascii="Times New Roman" w:eastAsia="Yu Gothic" w:hAnsi="Times New Roman" w:cs="Times New Roman"/>
+                <w:color w:val="000000"/>
+                <w:sz w:val="22"/>
+                <w:szCs w:val="22"/>
+              </w:rPr>
+              <w:t>57242 (100.0%)</w:t>
+            </w:r>
+          </w:p>
+        </w:tc>
+        <w:tc>
+          <w:tcPr>
+            <w:tcW w:w="1738" w:type="dxa"/>
+            <w:vAlign w:val="center"/>
+          </w:tcPr>
+          <w:p>
+            <w:pPr>
+              <w:widowControl/>
+              <w:jc w:val="center"/>
+              <w:rPr>
+                <w:rFonts w:ascii="Times New Roman" w:hAnsi="Times New Roman" w:cs="Times New Roman"/>
+                <w:sz w:val="22"/>
+                <w:szCs w:val="22"/>
+              </w:rPr>
+            </w:pPr>
+            <w:r>
+              <w:rPr>
+                <w:rFonts w:ascii="Times New Roman" w:eastAsia="Yu Gothic" w:hAnsi="Times New Roman" w:cs="Times New Roman"/>
+                <w:color w:val="000000"/>
+                <w:sz w:val="22"/>
+                <w:szCs w:val="22"/>
+              </w:rPr>
+              <w:t>222 (100.0%)</w:t>
+            </w:r>
+          </w:p>
+        </w:tc>
+        <w:tc>
+          <w:tcPr>
+            <w:tcW w:w="1738" w:type="dxa"/>
+            <w:vAlign w:val="center"/>
+          </w:tcPr>
+          <w:p>
+            <w:pPr>
+              <w:widowControl/>
+              <w:jc w:val="center"/>
+              <w:rPr>
+                <w:rFonts w:ascii="Times New Roman" w:hAnsi="Times New Roman" w:cs="Times New Roman"/>
+                <w:sz w:val="22"/>
+                <w:szCs w:val="22"/>
+              </w:rPr>
+            </w:pPr>
+            <w:r>
+              <w:rPr>
+                <w:rFonts w:ascii="Times New Roman" w:eastAsia="Yu Gothic" w:hAnsi="Times New Roman" w:cs="Times New Roman"/>
+                <w:color w:val="000000"/>
+                <w:sz w:val="22"/>
+                <w:szCs w:val="22"/>
+              </w:rPr>
+              <w:t>59113 (100.0%)</w:t>
+            </w:r>
+          </w:p>
+        </w:tc>
+      </w:tr>
+    </w:tbl>
+    <w:p>
+      <w:pPr>
+        <w:widowControl/>
+        <w:jc w:val="left"/>
+        <w:rPr>
+          <w:rFonts w:ascii="Times New Roman" w:hAnsi="Times New Roman" w:cs="Times New Roman"/>
+          <w:sz w:val="22"/>
+          <w:szCs w:val="22"/>
+        </w:rPr>
+      </w:pPr>
+      <w:r>
+        <w:rPr>
+          <w:rFonts w:ascii="Times New Roman" w:hAnsi="Times New Roman" w:cs="Times New Roman"/>
+          <w:sz w:val="22"/>
+          <w:szCs w:val="22"/>
+        </w:rPr>
+        <w:t>Values are n (%) of clinical alarms within each priority level. Percentages for the Total column represent proportions of all clinical alarms (N = 59,113). "—" indicates no alarms of this parameter were recorded</w:t>
+      </w:r>
+      <w:r>
+        <w:rPr>
+          <w:rFonts w:ascii="Times New Roman" w:hAnsi="Times New Roman" w:cs="Times New Roman"/>
+          <w:sz w:val="22"/>
+          <w:szCs w:val="22"/>
+        </w:rPr>
+        <w:t xml:space="preserve"> </w:t>
+      </w:r>
+      <w:r>
+        <w:rPr>
+          <w:rFonts w:ascii="Times New Roman" w:hAnsi="Times New Roman" w:cs="Times New Roman"/>
+          <w:sz w:val="22"/>
+          <w:szCs w:val="22"/>
+        </w:rPr>
+        <w:t>at this priority level during the observation period.                                                                                                                                                            CRISIS-level alarms exclusively comprised life-threatening arrhythmias (ventricular fibrillation, ventricular tachycardia, and asystole), consistent with the bedside monitoring system's priority classification scheme, in which CRISIS is reserved for conditions requiring immediate intervention. The predominance of SpO2-related alarms within the WARNING category (44,413/57,242; 77.6%) and VPC Run within the ADVISOR</w:t>
+      </w:r>
+      <w:r>
+        <w:rPr>
+          <w:rFonts w:ascii="Times New Roman" w:hAnsi="Times New Roman" w:cs="Times New Roman"/>
+          <w:sz w:val="22"/>
+          <w:szCs w:val="22"/>
+        </w:rPr>
+        <w:t xml:space="preserve">Y </w:t>
+      </w:r>
+      <w:r>
+        <w:rPr>
+          <w:rFonts w:ascii="Times New Roman" w:hAnsi="Times New Roman" w:cs="Times New Roman"/>
+          <w:sz w:val="22"/>
+          <w:szCs w:val="22"/>
+        </w:rPr>
+        <w:t>category (1,574/1,649; 95.5%) reflects the physiological monitoring profile of a post-surgical ward. Alarm parameters were recorded as displayed on the central monitoring system and were not modified by the</w:t>
+      </w:r>
+      <w:r>
+        <w:rPr>
+          <w:rFonts w:ascii="Times New Roman" w:hAnsi="Times New Roman" w:cs="Times New Roman"/>
+          <w:sz w:val="22"/>
+          <w:szCs w:val="22"/>
+        </w:rPr>
+        <w:t xml:space="preserve"> </w:t>
+      </w:r>
+      <w:r>
+        <w:rPr>
+          <w:rFonts w:ascii="Times New Roman" w:hAnsi="Times New Roman" w:cs="Times New Roman"/>
+          <w:sz w:val="22"/>
+          <w:szCs w:val="22"/>
+        </w:rPr>
+        <w:t xml:space="preserve">investigators. </w:t>
+      </w:r>
     </w:p>
     <w:p>
       <w:pPr>
-        <w:tabs>
-          <w:tab w:val="left" w:pos="1196"/>
-        </w:tabs>
+        <w:widowControl/>
+        <w:jc w:val="left"/>
         <w:rPr>
           <w:rFonts w:ascii="Times New Roman" w:hAnsi="Times New Roman" w:cs="Times New Roman"/>
           <w:sz w:val="22"/>
@@ -8782,33 +11768,134 @@
           <w:sz w:val="22"/>
           <w:szCs w:val="22"/>
         </w:rPr>
-        <w:lastRenderedPageBreak/>
-        <w:t>Figure S3.</w:t>
+        <w:br w:type="page"/>
       </w:r>
     </w:p>
     <w:p>
       <w:pPr>
-        <w:tabs>
-          <w:tab w:val="left" w:pos="1196"/>
-        </w:tabs>
+        <w:widowControl/>
+        <w:jc w:val="left"/>
         <w:rPr>
           <w:rFonts w:ascii="Times New Roman" w:hAnsi="Times New Roman" w:cs="Times New Roman"/>
           <w:sz w:val="22"/>
           <w:szCs w:val="22"/>
         </w:rPr>
       </w:pPr>
+      <w:r>
+        <w:rPr>
+          <w:rFonts w:ascii="Times New Roman" w:hAnsi="Times New Roman" w:cs="Times New Roman"/>
+          <w:sz w:val="22"/>
+          <w:szCs w:val="22"/>
+        </w:rPr>
+        <w:lastRenderedPageBreak/>
+        <w:t xml:space="preserve">Figure S2. </w:t>
+      </w:r>
+      <w:r>
+        <w:rPr>
+          <w:rFonts w:ascii="Times New Roman" w:hAnsi="Times New Roman" w:cs="Times New Roman"/>
+          <w:sz w:val="22"/>
+          <w:szCs w:val="22"/>
+        </w:rPr>
+        <w:t>Bed-level random intercepts from the mixed-effects logistic regression model</w:t>
+      </w:r>
     </w:p>
     <w:p>
       <w:pPr>
-        <w:tabs>
-          <w:tab w:val="left" w:pos="1196"/>
-        </w:tabs>
+        <w:widowControl/>
+        <w:jc w:val="left"/>
         <w:rPr>
           <w:rFonts w:ascii="Times New Roman" w:hAnsi="Times New Roman" w:cs="Times New Roman"/>
           <w:sz w:val="22"/>
           <w:szCs w:val="22"/>
         </w:rPr>
       </w:pPr>
+      <w:r>
+        <w:rPr>
+          <w:rFonts w:ascii="Times New Roman" w:hAnsi="Times New Roman" w:cs="Times New Roman"/>
+          <w:noProof/>
+          <w:sz w:val="22"/>
+          <w:szCs w:val="22"/>
+        </w:rPr>
+        <w:drawing>
+          <wp:inline distT="0" distB="0" distL="0" distR="0" wp14:anchorId="0E07CA53" wp14:editId="0F4D6DB3">
+            <wp:extent cx="3073400" cy="2616200"/>
+            <wp:effectExtent l="0" t="0" r="0" b="0"/>
+            <wp:docPr id="1241025159" name="図 1"/>
+            <wp:cNvGraphicFramePr>
+              <a:graphicFrameLocks xmlns:a="http://schemas.openxmlformats.org/drawingml/2006/main" noChangeAspect="1"/>
+            </wp:cNvGraphicFramePr>
+            <a:graphic xmlns:a="http://schemas.openxmlformats.org/drawingml/2006/main">
+              <a:graphicData uri="http://schemas.openxmlformats.org/drawingml/2006/picture">
+                <pic:pic xmlns:pic="http://schemas.openxmlformats.org/drawingml/2006/picture">
+                  <pic:nvPicPr>
+                    <pic:cNvPr id="1241025159" name="図 1241025159"/>
+                    <pic:cNvPicPr/>
+                  </pic:nvPicPr>
+                  <pic:blipFill>
+                    <a:blip r:embed="rId8" cstate="print">
+                      <a:extLst>
+                        <a:ext uri="{28A0092B-C50C-407E-A947-70E740481C1C}">
+                          <a14:useLocalDpi xmlns:a14="http://schemas.microsoft.com/office/drawing/2010/main" val="0"/>
+                        </a:ext>
+                      </a:extLst>
+                    </a:blip>
+                    <a:stretch>
+                      <a:fillRect/>
+                    </a:stretch>
+                  </pic:blipFill>
+                  <pic:spPr>
+                    <a:xfrm>
+                      <a:off x="0" y="0"/>
+                      <a:ext cx="3073400" cy="2616200"/>
+                    </a:xfrm>
+                    <a:prstGeom prst="rect">
+                      <a:avLst/>
+                    </a:prstGeom>
+                  </pic:spPr>
+                </pic:pic>
+              </a:graphicData>
+            </a:graphic>
+          </wp:inline>
+        </w:drawing>
+      </w:r>
+    </w:p>
+    <w:p>
+      <w:pPr>
+        <w:widowControl/>
+        <w:jc w:val="left"/>
+        <w:rPr>
+          <w:rFonts w:ascii="Times New Roman" w:hAnsi="Times New Roman" w:cs="Times New Roman"/>
+          <w:sz w:val="22"/>
+          <w:szCs w:val="22"/>
+        </w:rPr>
+      </w:pPr>
+      <w:r>
+        <w:rPr>
+          <w:rFonts w:ascii="Times New Roman" w:hAnsi="Times New Roman" w:cs="Times New Roman"/>
+          <w:sz w:val="22"/>
+          <w:szCs w:val="22"/>
+        </w:rPr>
+        <w:t>no single bed location disproportionately drives the overall findings. Because bed occupancy changed over the observation period, the random intercept reflects a combination of location-specific factors (e.g., proximity to the nursing station, habitual patient assignment) rather than individual patient characteristics.</w:t>
+      </w:r>
+    </w:p>
+    <w:p>
+      <w:pPr>
+        <w:widowControl/>
+        <w:jc w:val="left"/>
+        <w:rPr>
+          <w:rFonts w:ascii="Times New Roman" w:hAnsi="Times New Roman" w:cs="Times New Roman"/>
+          <w:sz w:val="22"/>
+          <w:szCs w:val="22"/>
+        </w:rPr>
+      </w:pPr>
+      <w:r>
+        <w:rPr>
+          <w:rFonts w:ascii="Times New Roman" w:hAnsi="Times New Roman" w:cs="Times New Roman"/>
+          <w:sz w:val="22"/>
+          <w:szCs w:val="22"/>
+        </w:rPr>
+        <w:t xml:space="preserve">                       </w:t>
+      </w:r>
     </w:p>
     <w:sectPr>
       <w:pgSz w:w="11906" w:h="16838"/>

</xml_diff>